<commit_message>
Ảnh bán hàng theo trình tự người mua tự hỏi, bỏ hướng dẫn 4 bước, thêm tín hiệu chống lừa đảo
Co-Authored-By: Claude Opus 5.5 <noreply@anthropic.com>
Claude-Session: https://claude.ai/code/session_016W4H5FXW9gSiS33Aau8aSB
</commit_message>
<xml_diff>
--- a/BO-TAI-LIEU-GUI-KHACH/00-DOC-DAU-TIEN-Huong-dan-su-dung.docx
+++ b/BO-TAI-LIEU-GUI-KHACH/00-DOC-DAU-TIEN-Huong-dan-su-dung.docx
@@ -4781,7 +4781,7 @@
           <w:sz w:val="23"/>
           <w:szCs w:val="23"/>
         </w:rPr>
-        <w:t xml:space="preserve">Mua chính thức trên </w:t>
+        <w:t xml:space="preserve">Chỉ bán qua một đường link duy nhất trên </w:t>
       </w:r>
       <w:r>
         <w:rPr>
@@ -4801,7 +4801,7 @@
           <w:sz w:val="23"/>
           <w:szCs w:val="23"/>
         </w:rPr>
-        <w:t xml:space="preserve">, nền tảng bán sản phẩm số cho người Việt. Người mua thanh toán bằng cách quét mã </w:t>
+        <w:t xml:space="preserve">. Người mua thanh toán bằng cách quét mã </w:t>
       </w:r>
       <w:r>
         <w:rPr>
@@ -4821,7 +4821,46 @@
           <w:sz w:val="23"/>
           <w:szCs w:val="23"/>
         </w:rPr>
-        <w:t xml:space="preserve"> trên nền tảng. Không giao dịch ngoài.</w:t>
+        <w:t xml:space="preserve"> ngay trên trang.</w:t>
+      </w:r>
+    </w:p>
+    <w:p>
+      <w:pPr>
+        <w:pStyle w:val="ListParagraph"/>
+        <w:numPr>
+          <w:ilvl w:val="0"/>
+          <w:numId w:val="2"/>
+        </w:numPr>
+        <w:spacing w:after="90" w:line="310"/>
+      </w:pPr>
+      <w:r>
+        <w:rPr>
+          <w:rFonts w:ascii="Arial" w:cs="Arial" w:eastAsia="Arial" w:hAnsi="Arial"/>
+          <w:color w:val="2E3A67"/>
+          <w:sz w:val="23"/>
+          <w:szCs w:val="23"/>
+        </w:rPr>
+        <w:t xml:space="preserve">Tác giả </w:t>
+      </w:r>
+      <w:r>
+        <w:rPr>
+          <w:rFonts w:ascii="Arial" w:cs="Arial" w:eastAsia="Arial" w:hAnsi="Arial"/>
+          <w:b/>
+          <w:bCs/>
+          <w:color w:val="2E3A67"/>
+          <w:sz w:val="23"/>
+          <w:szCs w:val="23"/>
+        </w:rPr>
+        <w:t xml:space="preserve">không bao giờ</w:t>
+      </w:r>
+      <w:r>
+        <w:rPr>
+          <w:rFonts w:ascii="Arial" w:cs="Arial" w:eastAsia="Arial" w:hAnsi="Arial"/>
+          <w:color w:val="2E3A67"/>
+          <w:sz w:val="23"/>
+          <w:szCs w:val="23"/>
+        </w:rPr>
+        <w:t xml:space="preserve"> nhắn tin riêng xin chuyển khoản vào tài khoản cá nhân, không gửi link mua nào khác, không hỏi mã OTP hay mật khẩu ngân hàng. Nếu thầy cô gặp trường hợp như vậy, đó không phải tác giả.</w:t>
       </w:r>
     </w:p>
     <w:p>

</xml_diff>

<commit_message>
Căn cứ xếp theo đối tượng giáo viên: văn bản Bộ GDĐT 2026 đứng đầu
- Thông tư 18/2026/TT-BGDĐT, CV 5385/BGDĐT-GDMN, CV 5208/BGDĐT-GDPT, QĐ 2422/QĐ-BGDĐT, CV 5588/BGDĐT-GDPT, Chỉ thị 31/CT-TTg
- Bài 34 viết lại theo Khung năng lực số của giáo viên
- Bỏ mã cũ trong chú thích hình, 197 tham chiếu trang kiểm tra lại
- Ảnh bán 1 và 2 cập nhật theo văn bản Bộ GDĐT 2026

Co-Authored-By: Claude Opus 5.5 <noreply@anthropic.com>
Claude-Session: https://claude.ai/code/session_016W4H5FXW9gSiS33Aau8aSB
</commit_message>
<xml_diff>
--- a/BO-TAI-LIEU-GUI-KHACH/00-DOC-DAU-TIEN-Huong-dan-su-dung.docx
+++ b/BO-TAI-LIEU-GUI-KHACH/00-DOC-DAU-TIEN-Huong-dan-su-dung.docx
@@ -858,7 +858,7 @@
                 <w:sz w:val="22"/>
                 <w:szCs w:val="22"/>
               </w:rPr>
-              <w:t xml:space="preserve">Nếu thầy cô chỉ có 30 phút hôm nay: đọc hết tệp này (khoảng 10 phút), rồi mở tệp 01 và làm Bài 1 (trang 9), Bài 2 (trang 10).</w:t>
+              <w:t xml:space="preserve">Nếu thầy cô chỉ có 30 phút hôm nay: đọc hết tệp này (khoảng 10 phút), rồi mở tệp 01 và làm Bài 1 (trang 10), Bài 2 (trang 11).</w:t>
             </w:r>
           </w:p>
         </w:tc>
@@ -1116,7 +1116,7 @@
                 <w:sz w:val="21"/>
                 <w:szCs w:val="21"/>
               </w:rPr>
-              <w:t xml:space="preserve">Bài 1 (trang 9), Bài 2 (trang 10), Bài 3 (trang 12)</w:t>
+              <w:t xml:space="preserve">Bài 1 (trang 10), Bài 2 (trang 11), Bài 3 (trang 13)</w:t>
             </w:r>
           </w:p>
         </w:tc>
@@ -1214,7 +1214,7 @@
                 <w:sz w:val="21"/>
                 <w:szCs w:val="21"/>
               </w:rPr>
-              <w:t xml:space="preserve">Bài 4 (trang 15) đến Bài 8 (trang 21)</w:t>
+              <w:t xml:space="preserve">Bài 4 (trang 16) đến Bài 8 (trang 22)</w:t>
             </w:r>
           </w:p>
         </w:tc>
@@ -1312,7 +1312,7 @@
                 <w:sz w:val="21"/>
                 <w:szCs w:val="21"/>
               </w:rPr>
-              <w:t xml:space="preserve">Bài 9 (trang 23), Bài 10 (trang 24), Bài 11 (trang 27), Bài 12 (trang 28)</w:t>
+              <w:t xml:space="preserve">Bài 9 (trang 24), Bài 10 (trang 25), Bài 11 (trang 28), Bài 12 (trang 29)</w:t>
             </w:r>
           </w:p>
         </w:tc>
@@ -1410,7 +1410,7 @@
                 <w:sz w:val="21"/>
                 <w:szCs w:val="21"/>
               </w:rPr>
-              <w:t xml:space="preserve">Bài 13 (trang 29) đến Bài 17 (trang 35)</w:t>
+              <w:t xml:space="preserve">Bài 13 (trang 30) đến Bài 17 (trang 36)</w:t>
             </w:r>
           </w:p>
         </w:tc>
@@ -1508,7 +1508,7 @@
                 <w:sz w:val="21"/>
                 <w:szCs w:val="21"/>
               </w:rPr>
-              <w:t xml:space="preserve">Bài 20 (trang 40) đến Bài 23 (trang 45)</w:t>
+              <w:t xml:space="preserve">Bài 20 (trang 41) đến Bài 23 (trang 46)</w:t>
             </w:r>
           </w:p>
         </w:tc>
@@ -1606,7 +1606,7 @@
                 <w:sz w:val="21"/>
                 <w:szCs w:val="21"/>
               </w:rPr>
-              <w:t xml:space="preserve">Bài 24 (trang 46) đến Bài 27 (trang 52)</w:t>
+              <w:t xml:space="preserve">Bài 24 (trang 47) đến Bài 27 (trang 53)</w:t>
             </w:r>
           </w:p>
         </w:tc>
@@ -1704,7 +1704,7 @@
                 <w:sz w:val="21"/>
                 <w:szCs w:val="21"/>
               </w:rPr>
-              <w:t xml:space="preserve">Bài 31 (trang 59), Bài 34 (trang 66), Bài 35 (trang 67), Bài 36 (trang 68)</w:t>
+              <w:t xml:space="preserve">Bài 31 (trang 60), Bài 34 (trang 67), Bài 35 (trang 69), Bài 36 (trang 70)</w:t>
             </w:r>
           </w:p>
         </w:tc>
@@ -1735,7 +1735,7 @@
                 <w:sz w:val="21"/>
                 <w:szCs w:val="21"/>
               </w:rPr>
-              <w:t xml:space="preserve">Một chatbot trợ giảng đã tự thử. Tự chấm theo danh sách ở Bài 36 (trang 68).</w:t>
+              <w:t xml:space="preserve">Một chatbot trợ giảng đã tự thử. Tự chấm theo danh sách ở Bài 36 (trang 70).</w:t>
             </w:r>
           </w:p>
         </w:tc>
@@ -1777,7 +1777,7 @@
           <w:sz w:val="23"/>
           <w:szCs w:val="23"/>
         </w:rPr>
-        <w:t xml:space="preserve"> có thể bỏ qua Bài 15 (trang 31), Bài 16 (trang 33), Bài 18 (trang 37). Thầy cô </w:t>
+        <w:t xml:space="preserve"> có thể bỏ qua Bài 15 (trang 32), Bài 16 (trang 34), Bài 18 (trang 38). Thầy cô </w:t>
       </w:r>
       <w:r>
         <w:rPr>
@@ -1797,7 +1797,7 @@
           <w:sz w:val="23"/>
           <w:szCs w:val="23"/>
         </w:rPr>
-        <w:t xml:space="preserve"> có thể bỏ qua Bài 24 (trang 46). Muốn tìm bài theo việc cần làm, mở Phụ lục 1 (trang 70).</w:t>
+        <w:t xml:space="preserve"> có thể bỏ qua Bài 24 (trang 47). Muốn tìm bài theo việc cần làm, mở Phụ lục 1 (trang 72).</w:t>
       </w:r>
     </w:p>
     <w:p>
@@ -2240,7 +2240,7 @@
                 <w:sz w:val="21"/>
                 <w:szCs w:val="21"/>
               </w:rPr>
-              <w:t xml:space="preserve">Bài 2 (tr. 10), Bài 22 (tr. 43), Bài 31 (tr. 59)</w:t>
+              <w:t xml:space="preserve">Bài 2 (tr. 11), Bài 22 (tr. 44), Bài 31 (tr. 60)</w:t>
             </w:r>
           </w:p>
         </w:tc>
@@ -2338,7 +2338,7 @@
                 <w:sz w:val="21"/>
                 <w:szCs w:val="21"/>
               </w:rPr>
-              <w:t xml:space="preserve">Bài 19 (tr. 38)</w:t>
+              <w:t xml:space="preserve">Bài 19 (tr. 39)</w:t>
             </w:r>
           </w:p>
         </w:tc>
@@ -2436,7 +2436,7 @@
                 <w:sz w:val="21"/>
                 <w:szCs w:val="21"/>
               </w:rPr>
-              <w:t xml:space="preserve">Bài 23 (tr. 45), Bài 26 (tr. 50), Bài 27 (tr. 52)</w:t>
+              <w:t xml:space="preserve">Bài 23 (tr. 46), Bài 26 (tr. 51), Bài 27 (tr. 53)</w:t>
             </w:r>
           </w:p>
         </w:tc>
@@ -2534,7 +2534,7 @@
                 <w:sz w:val="21"/>
                 <w:szCs w:val="21"/>
               </w:rPr>
-              <w:t xml:space="preserve">Bài 21 (tr. 42), Bài 22 (tr. 43)</w:t>
+              <w:t xml:space="preserve">Bài 21 (tr. 43), Bài 22 (tr. 44)</w:t>
             </w:r>
           </w:p>
         </w:tc>
@@ -2632,7 +2632,7 @@
                 <w:sz w:val="21"/>
                 <w:szCs w:val="21"/>
               </w:rPr>
-              <w:t xml:space="preserve">Bài 24 (tr. 46)</w:t>
+              <w:t xml:space="preserve">Bài 24 (tr. 47)</w:t>
             </w:r>
           </w:p>
         </w:tc>
@@ -2730,7 +2730,7 @@
                 <w:sz w:val="21"/>
                 <w:szCs w:val="21"/>
               </w:rPr>
-              <w:t xml:space="preserve">Bài 18 (tr. 37)</w:t>
+              <w:t xml:space="preserve">Bài 18 (tr. 38)</w:t>
             </w:r>
           </w:p>
         </w:tc>
@@ -2828,7 +2828,7 @@
                 <w:sz w:val="21"/>
                 <w:szCs w:val="21"/>
               </w:rPr>
-              <w:t xml:space="preserve">Bài 32 (tr. 62)</w:t>
+              <w:t xml:space="preserve">Bài 32 (tr. 63)</w:t>
             </w:r>
           </w:p>
         </w:tc>
@@ -2926,7 +2926,7 @@
                 <w:sz w:val="21"/>
                 <w:szCs w:val="21"/>
               </w:rPr>
-              <w:t xml:space="preserve">Bài 33 (tr. 63)</w:t>
+              <w:t xml:space="preserve">Bài 33 (tr. 64)</w:t>
             </w:r>
           </w:p>
         </w:tc>
@@ -3348,7 +3348,41 @@
           <w:sz w:val="23"/>
           <w:szCs w:val="23"/>
         </w:rPr>
-        <w:t xml:space="preserve"> (hiệu lực từ 01/1/2026). Chi tiết ở Bài 35 (trang 67) trong sách.</w:t>
+        <w:t xml:space="preserve"> (hiệu lực từ 01/1/2026). Chi tiết ở Bài 35 (trang 69) trong sách.</w:t>
+      </w:r>
+    </w:p>
+    <w:p>
+      <w:pPr>
+        <w:spacing w:after="140" w:line="320"/>
+      </w:pPr>
+      <w:r>
+        <w:rPr>
+          <w:rFonts w:ascii="Arial" w:cs="Arial" w:eastAsia="Arial" w:hAnsi="Arial"/>
+          <w:color w:val="2E3A67"/>
+          <w:sz w:val="23"/>
+          <w:szCs w:val="23"/>
+        </w:rPr>
+        <w:t xml:space="preserve">Với </w:t>
+      </w:r>
+      <w:r>
+        <w:rPr>
+          <w:rFonts w:ascii="Arial" w:cs="Arial" w:eastAsia="Arial" w:hAnsi="Arial"/>
+          <w:b/>
+          <w:bCs/>
+          <w:color w:val="2E3A67"/>
+          <w:sz w:val="23"/>
+          <w:szCs w:val="23"/>
+        </w:rPr>
+        <w:t xml:space="preserve">mầm non</w:t>
+      </w:r>
+      <w:r>
+        <w:rPr>
+          <w:rFonts w:ascii="Arial" w:cs="Arial" w:eastAsia="Arial" w:hAnsi="Arial"/>
+          <w:color w:val="2E3A67"/>
+          <w:sz w:val="23"/>
+          <w:szCs w:val="23"/>
+        </w:rPr>
+        <w:t xml:space="preserve">, Công văn 5385/BGDĐT-GDMN (12/8/2026) nhấn mạnh công nghệ số chỉ dùng để hỗ trợ giáo viên thiết kế hoạt động, phối hợp với gia đình và phải bảo đảm an toàn, riêng tư của trẻ. Thông tư 18/2026/TT-BGDĐT cũng yêu cầu giáo viên dùng AI bảo đảm minh bạch, công bằng, bảo vệ dữ liệu cá nhân.</w:t>
       </w:r>
     </w:p>
     <w:p>
@@ -4355,7 +4389,7 @@
                 <w:sz w:val="21"/>
                 <w:szCs w:val="21"/>
               </w:rPr>
-              <w:t xml:space="preserve">Slide 1 đến 10 · Bài 1 (trang 9) đến Bài 10 (trang 24)</w:t>
+              <w:t xml:space="preserve">Slide 1 đến 10 · Bài 1 (trang 10) đến Bài 10 (trang 25)</w:t>
             </w:r>
           </w:p>
         </w:tc>
@@ -4453,7 +4487,7 @@
                 <w:sz w:val="21"/>
                 <w:szCs w:val="21"/>
               </w:rPr>
-              <w:t xml:space="preserve">Slide 11 đến 14 · Bài 11 (trang 27) đến Bài 19 (trang 38)</w:t>
+              <w:t xml:space="preserve">Slide 11 đến 14 · Bài 11 (trang 28) đến Bài 19 (trang 39)</w:t>
             </w:r>
           </w:p>
         </w:tc>
@@ -4551,7 +4585,7 @@
                 <w:sz w:val="21"/>
                 <w:szCs w:val="21"/>
               </w:rPr>
-              <w:t xml:space="preserve">Slide 15 đến 17 · Bài 20 (trang 40) đến Bài 27 (trang 52)</w:t>
+              <w:t xml:space="preserve">Slide 15 đến 17 · Bài 20 (trang 41) đến Bài 27 (trang 53)</w:t>
             </w:r>
           </w:p>
         </w:tc>
@@ -4649,7 +4683,7 @@
                 <w:sz w:val="21"/>
                 <w:szCs w:val="21"/>
               </w:rPr>
-              <w:t xml:space="preserve">Slide 18 đến 24 · Bài 28 (trang 55) đến Bài 36 (trang 68)</w:t>
+              <w:t xml:space="preserve">Slide 18 đến 24 · Bài 28 (trang 56) đến Bài 36 (trang 70)</w:t>
             </w:r>
           </w:p>
         </w:tc>
@@ -4958,7 +4992,7 @@
           <w:sz w:val="23"/>
           <w:szCs w:val="23"/>
         </w:rPr>
-        <w:t xml:space="preserve">Các bài trong sách được đối chiếu với văn bản pháp luật và hướng dẫn chuyên môn dưới đây. Tôi ưu tiên văn bản ban hành 2025-2026 và định hướng đến năm 2030. Đầu mỗi bài có dòng </w:t>
+        <w:t xml:space="preserve">Các bài trong sách được đối chiếu với văn bản pháp luật và hướng dẫn chuyên môn dưới đây. Tôi xếp văn bản theo thứ tự thầy cô cần quan tâm: trước hết là văn bản mới nhất của Bộ GDĐT năm 2026 dành cho giáo viên và năm học 2026-2027, sau đó là văn bản chuyên môn đang áp dụng, văn bản của Sở GDĐT, cuối cùng là luật và định hướng quốc gia có liên quan. Đầu mỗi bài có dòng </w:t>
       </w:r>
       <w:r>
         <w:rPr>
@@ -5029,7 +5063,7 @@
           <w:sz w:val="26"/>
           <w:szCs w:val="26"/>
         </w:rPr>
-        <w:t xml:space="preserve">Định hướng quốc gia đến năm 2030</w:t>
+        <w:t xml:space="preserve">Văn bản của Bộ GDĐT năm 2026 cho giáo viên và năm học 2026-2027</w:t>
       </w:r>
     </w:p>
     <w:tbl>
@@ -5179,18 +5213,18 @@
                 <w:sz w:val="21"/>
                 <w:szCs w:val="21"/>
               </w:rPr>
-              <w:t xml:space="preserve">Chiến lược quốc gia về trí tuệ nhân tạo đến năm 2030, tầm nhìn 2045</w:t>
-            </w:r>
-            <w:r>
-              <w:rPr>
-                <w:rFonts w:ascii="Arial" w:cs="Arial" w:eastAsia="Arial" w:hAnsi="Arial"/>
-                <w:b w:val="false"/>
-                <w:bCs w:val="false"/>
-                <w:color w:val="2E3A67"/>
-                <w:sz w:val="21"/>
-                <w:szCs w:val="21"/>
-              </w:rPr>
-              <w:t xml:space="preserve">. Quyết định 1671/QĐ-TTg ngày 28/8/2026</w:t>
+              <w:t xml:space="preserve">Khung năng lực số đối với giáo viên, cán bộ quản lý cơ sở giáo dục mầm non, phổ thông, giáo dục thường xuyên</w:t>
+            </w:r>
+            <w:r>
+              <w:rPr>
+                <w:rFonts w:ascii="Arial" w:cs="Arial" w:eastAsia="Arial" w:hAnsi="Arial"/>
+                <w:b w:val="false"/>
+                <w:bCs w:val="false"/>
+                <w:color w:val="2E3A67"/>
+                <w:sz w:val="21"/>
+                <w:szCs w:val="21"/>
+              </w:rPr>
+              <w:t xml:space="preserve">. Thông tư 18/2026/TT-BGDĐT ngày 27/3/2026, hiệu lực 12/5/2026</w:t>
             </w:r>
           </w:p>
         </w:tc>
@@ -5221,7 +5255,7 @@
                 <w:sz w:val="21"/>
                 <w:szCs w:val="21"/>
               </w:rPr>
-              <w:t xml:space="preserve">Chuyển đổi AI quốc gia: AI trở thành năng lực cốt lõi, trong đó có giáo dục.</w:t>
+              <w:t xml:space="preserve">6 miền năng lực, 20 năng lực thành phần, 3 mức. Lần đầu AI là một miền năng lực riêng: giáo viên ứng dụng AI trong dạy học, bảo đảm minh bạch, công bằng, bảo vệ dữ liệu cá nhân.</w:t>
             </w:r>
           </w:p>
         </w:tc>
@@ -5252,7 +5286,7 @@
                 <w:sz w:val="21"/>
                 <w:szCs w:val="21"/>
               </w:rPr>
-              <w:t xml:space="preserve">Toàn bộ sách</w:t>
+              <w:t xml:space="preserve">Toàn bộ sách, Bài 34 (tr. 67)</w:t>
             </w:r>
           </w:p>
         </w:tc>
@@ -5288,18 +5322,18 @@
                 <w:sz w:val="21"/>
                 <w:szCs w:val="21"/>
               </w:rPr>
-              <w:t xml:space="preserve">Chương trình phát triển nhân lực trí tuệ nhân tạo đến năm 2030</w:t>
-            </w:r>
-            <w:r>
-              <w:rPr>
-                <w:rFonts w:ascii="Arial" w:cs="Arial" w:eastAsia="Arial" w:hAnsi="Arial"/>
-                <w:b w:val="false"/>
-                <w:bCs w:val="false"/>
-                <w:color w:val="2E3A67"/>
-                <w:sz w:val="21"/>
-                <w:szCs w:val="21"/>
-              </w:rPr>
-              <w:t xml:space="preserve">. Quyết định 1528/QĐ-TTg năm 2026</w:t>
+              <w:t xml:space="preserve">Hướng dẫn thực hiện nhiệm vụ giáo dục mầm non năm học 2026-2027</w:t>
+            </w:r>
+            <w:r>
+              <w:rPr>
+                <w:rFonts w:ascii="Arial" w:cs="Arial" w:eastAsia="Arial" w:hAnsi="Arial"/>
+                <w:b w:val="false"/>
+                <w:bCs w:val="false"/>
+                <w:color w:val="2E3A67"/>
+                <w:sz w:val="21"/>
+                <w:szCs w:val="21"/>
+              </w:rPr>
+              <w:t xml:space="preserve">. Công văn 5385/BGDĐT-GDMN ngày 12/8/2026</w:t>
             </w:r>
           </w:p>
         </w:tc>
@@ -5330,7 +5364,7 @@
                 <w:sz w:val="21"/>
                 <w:szCs w:val="21"/>
               </w:rPr>
-              <w:t xml:space="preserve">Nâng năng lực AI của người lao động, trong đó có đội ngũ giáo viên.</w:t>
+              <w:t xml:space="preserve">Bồi dưỡng giáo viên mầm non ứng dụng chuyển đổi số và AI. Công nghệ số dùng để hỗ trợ thiết kế hoạt động giáo dục, phối hợp với gia đình, bảo đảm an toàn và riêng tư của trẻ.</w:t>
             </w:r>
           </w:p>
         </w:tc>
@@ -5361,7 +5395,7 @@
                 <w:sz w:val="21"/>
                 <w:szCs w:val="21"/>
               </w:rPr>
-              <w:t xml:space="preserve">Toàn bộ sách</w:t>
+              <w:t xml:space="preserve">Dòng Mầm non ở mọi bảng Đổi cho lớp, Bài 35 (tr. 69)</w:t>
             </w:r>
           </w:p>
         </w:tc>
@@ -5397,18 +5431,18 @@
                 <w:sz w:val="21"/>
                 <w:szCs w:val="21"/>
               </w:rPr>
-              <w:t xml:space="preserve">Nghị quyết về đột phá phát triển giáo dục và đào tạo</w:t>
-            </w:r>
-            <w:r>
-              <w:rPr>
-                <w:rFonts w:ascii="Arial" w:cs="Arial" w:eastAsia="Arial" w:hAnsi="Arial"/>
-                <w:b w:val="false"/>
-                <w:bCs w:val="false"/>
-                <w:color w:val="2E3A67"/>
-                <w:sz w:val="21"/>
-                <w:szCs w:val="21"/>
-              </w:rPr>
-              <w:t xml:space="preserve">. Nghị quyết 71-NQ/TW ngày 22/8/2025 của Bộ Chính trị</w:t>
+              <w:t xml:space="preserve">Hướng dẫn thực hiện nhiệm vụ giáo dục phổ thông năm học 2026-2027</w:t>
+            </w:r>
+            <w:r>
+              <w:rPr>
+                <w:rFonts w:ascii="Arial" w:cs="Arial" w:eastAsia="Arial" w:hAnsi="Arial"/>
+                <w:b w:val="false"/>
+                <w:bCs w:val="false"/>
+                <w:color w:val="2E3A67"/>
+                <w:sz w:val="21"/>
+                <w:szCs w:val="21"/>
+              </w:rPr>
+              <w:t xml:space="preserve">. Công văn 5208/BGDĐT-GDPT ngày 07/8/2026</w:t>
             </w:r>
           </w:p>
         </w:tc>
@@ -5439,7 +5473,7 @@
                 <w:sz w:val="21"/>
                 <w:szCs w:val="21"/>
               </w:rPr>
-              <w:t xml:space="preserve">Mục tiêu giáo dục đến 2030, 2035, 2045.</w:t>
+              <w:t xml:space="preserve">Đẩy mạnh chuyển đổi số. Học sinh dùng công nghệ và AI an toàn, có trách nhiệm, trung thực; không lệ thuộc, không lạm dụng.</w:t>
             </w:r>
           </w:p>
         </w:tc>
@@ -5470,7 +5504,7 @@
                 <w:sz w:val="21"/>
                 <w:szCs w:val="21"/>
               </w:rPr>
-              <w:t xml:space="preserve">Toàn bộ sách</w:t>
+              <w:t xml:space="preserve">Phần 3 (trang 27), Bài 31 (tr. 60), Bài 32 (tr. 63)</w:t>
             </w:r>
           </w:p>
         </w:tc>
@@ -5506,18 +5540,18 @@
                 <w:sz w:val="21"/>
                 <w:szCs w:val="21"/>
               </w:rPr>
-              <w:t xml:space="preserve">Nghị quyết về đột phá phát triển khoa học, công nghệ, đổi mới sáng tạo và chuyển đổi số quốc gia</w:t>
-            </w:r>
-            <w:r>
-              <w:rPr>
-                <w:rFonts w:ascii="Arial" w:cs="Arial" w:eastAsia="Arial" w:hAnsi="Arial"/>
-                <w:b w:val="false"/>
-                <w:bCs w:val="false"/>
-                <w:color w:val="2E3A67"/>
-                <w:sz w:val="21"/>
-                <w:szCs w:val="21"/>
-              </w:rPr>
-              <w:t xml:space="preserve">. Nghị quyết 57-NQ/TW ngày 22/12/2024 của Bộ Chính trị</w:t>
+              <w:t xml:space="preserve">Khung nội dung giáo dục trí tuệ nhân tạo cho học sinh phổ thông</w:t>
+            </w:r>
+            <w:r>
+              <w:rPr>
+                <w:rFonts w:ascii="Arial" w:cs="Arial" w:eastAsia="Arial" w:hAnsi="Arial"/>
+                <w:b w:val="false"/>
+                <w:bCs w:val="false"/>
+                <w:color w:val="2E3A67"/>
+                <w:sz w:val="21"/>
+                <w:szCs w:val="21"/>
+              </w:rPr>
+              <w:t xml:space="preserve">. Quyết định 2422/QĐ-BGDĐT ngày 18/8/2026</w:t>
             </w:r>
           </w:p>
         </w:tc>
@@ -5548,7 +5582,7 @@
                 <w:sz w:val="21"/>
                 <w:szCs w:val="21"/>
               </w:rPr>
-              <w:t xml:space="preserve">Định hướng chuyển đổi số, ứng dụng công nghệ mới.</w:t>
+              <w:t xml:space="preserve">Nội dung giáo dục AI chính thức cho học sinh phổ thông.</w:t>
             </w:r>
           </w:p>
         </w:tc>
@@ -5579,7 +5613,225 @@
                 <w:sz w:val="21"/>
                 <w:szCs w:val="21"/>
               </w:rPr>
-              <w:t xml:space="preserve">Toàn bộ sách</w:t>
+              <w:t xml:space="preserve">Bài 34 (tr. 67)</w:t>
+            </w:r>
+          </w:p>
+        </w:tc>
+      </w:tr>
+      <w:tr>
+        <w:trPr>
+          <w:cantSplit/>
+        </w:trPr>
+        <w:tc>
+          <w:tcPr>
+            <w:tcW w:type="dxa" w:w="3500"/>
+            <w:tcBorders>
+              <w:top w:val="none" w:color="FFFFFF" w:sz="0"/>
+              <w:left w:val="none" w:color="FFFFFF" w:sz="0"/>
+              <w:bottom w:val="single" w:color="D5DAE6" w:sz="4"/>
+              <w:right w:val="none" w:color="FFFFFF" w:sz="0"/>
+            </w:tcBorders>
+            <w:shd w:fill="EEF0F6" w:color="auto" w:val="clear"/>
+            <w:tcMar>
+              <w:top w:type="dxa" w:w="100"/>
+              <w:left w:type="dxa" w:w="160"/>
+              <w:bottom w:type="dxa" w:w="100"/>
+              <w:right w:type="dxa" w:w="160"/>
+            </w:tcMar>
+          </w:tcPr>
+          <w:p>
+            <w:r>
+              <w:rPr>
+                <w:rFonts w:ascii="Arial" w:cs="Arial" w:eastAsia="Arial" w:hAnsi="Arial"/>
+                <w:b/>
+                <w:bCs/>
+                <w:color w:val="2E3A67"/>
+                <w:sz w:val="21"/>
+                <w:szCs w:val="21"/>
+              </w:rPr>
+              <w:t xml:space="preserve">Hướng dẫn thực hiện nội dung giáo dục AI cho học sinh phổ thông từ năm học 2026-2027</w:t>
+            </w:r>
+            <w:r>
+              <w:rPr>
+                <w:rFonts w:ascii="Arial" w:cs="Arial" w:eastAsia="Arial" w:hAnsi="Arial"/>
+                <w:b w:val="false"/>
+                <w:bCs w:val="false"/>
+                <w:color w:val="2E3A67"/>
+                <w:sz w:val="21"/>
+                <w:szCs w:val="21"/>
+              </w:rPr>
+              <w:t xml:space="preserve">. Công văn 5588/BGDĐT-GDPT ngày 19/8/2026</w:t>
+            </w:r>
+          </w:p>
+        </w:tc>
+        <w:tc>
+          <w:tcPr>
+            <w:tcW w:type="dxa" w:w="3738"/>
+            <w:tcBorders>
+              <w:top w:val="none" w:color="FFFFFF" w:sz="0"/>
+              <w:left w:val="none" w:color="FFFFFF" w:sz="0"/>
+              <w:bottom w:val="single" w:color="D5DAE6" w:sz="4"/>
+              <w:right w:val="none" w:color="FFFFFF" w:sz="0"/>
+            </w:tcBorders>
+            <w:shd w:fill="EEF0F6" w:color="auto" w:val="clear"/>
+            <w:tcMar>
+              <w:top w:type="dxa" w:w="100"/>
+              <w:left w:type="dxa" w:w="160"/>
+              <w:bottom w:type="dxa" w:w="100"/>
+              <w:right w:type="dxa" w:w="160"/>
+            </w:tcMar>
+          </w:tcPr>
+          <w:p>
+            <w:r>
+              <w:rPr>
+                <w:rFonts w:ascii="Arial" w:cs="Arial" w:eastAsia="Arial" w:hAnsi="Arial"/>
+                <w:b w:val="false"/>
+                <w:bCs w:val="false"/>
+                <w:color w:val="2E3A67"/>
+                <w:sz w:val="21"/>
+                <w:szCs w:val="21"/>
+              </w:rPr>
+              <w:t xml:space="preserve">Nội dung cốt lõi 12 tiết/lớp/năm học. Học sinh dùng AI an toàn, có đạo đức, có trách nhiệm.</w:t>
+            </w:r>
+          </w:p>
+        </w:tc>
+        <w:tc>
+          <w:tcPr>
+            <w:tcW w:type="dxa" w:w="2400"/>
+            <w:tcBorders>
+              <w:top w:val="none" w:color="FFFFFF" w:sz="0"/>
+              <w:left w:val="none" w:color="FFFFFF" w:sz="0"/>
+              <w:bottom w:val="single" w:color="D5DAE6" w:sz="4"/>
+              <w:right w:val="none" w:color="FFFFFF" w:sz="0"/>
+            </w:tcBorders>
+            <w:shd w:fill="EEF0F6" w:color="auto" w:val="clear"/>
+            <w:tcMar>
+              <w:top w:type="dxa" w:w="100"/>
+              <w:left w:type="dxa" w:w="160"/>
+              <w:bottom w:type="dxa" w:w="100"/>
+              <w:right w:type="dxa" w:w="160"/>
+            </w:tcMar>
+          </w:tcPr>
+          <w:p>
+            <w:r>
+              <w:rPr>
+                <w:rFonts w:ascii="Arial" w:cs="Arial" w:eastAsia="Arial" w:hAnsi="Arial"/>
+                <w:b w:val="false"/>
+                <w:bCs w:val="false"/>
+                <w:color w:val="2E3A67"/>
+                <w:sz w:val="21"/>
+                <w:szCs w:val="21"/>
+              </w:rPr>
+              <w:t xml:space="preserve">Phần 5 (trang 55), Bài 34 (tr. 67)</w:t>
+            </w:r>
+          </w:p>
+        </w:tc>
+      </w:tr>
+      <w:tr>
+        <w:trPr>
+          <w:cantSplit/>
+        </w:trPr>
+        <w:tc>
+          <w:tcPr>
+            <w:tcW w:type="dxa" w:w="3500"/>
+            <w:tcBorders>
+              <w:top w:val="none" w:color="FFFFFF" w:sz="0"/>
+              <w:left w:val="none" w:color="FFFFFF" w:sz="0"/>
+              <w:bottom w:val="single" w:color="D5DAE6" w:sz="4"/>
+              <w:right w:val="none" w:color="FFFFFF" w:sz="0"/>
+            </w:tcBorders>
+            <w:shd w:fill="FFFFFF" w:color="auto" w:val="clear"/>
+            <w:tcMar>
+              <w:top w:type="dxa" w:w="100"/>
+              <w:left w:type="dxa" w:w="160"/>
+              <w:bottom w:type="dxa" w:w="100"/>
+              <w:right w:type="dxa" w:w="160"/>
+            </w:tcMar>
+          </w:tcPr>
+          <w:p>
+            <w:r>
+              <w:rPr>
+                <w:rFonts w:ascii="Arial" w:cs="Arial" w:eastAsia="Arial" w:hAnsi="Arial"/>
+                <w:b/>
+                <w:bCs/>
+                <w:color w:val="2E3A67"/>
+                <w:sz w:val="21"/>
+                <w:szCs w:val="21"/>
+              </w:rPr>
+              <w:t xml:space="preserve">Chỉ thị của Thủ tướng về nhiệm vụ trọng tâm năm học 2026-2027</w:t>
+            </w:r>
+            <w:r>
+              <w:rPr>
+                <w:rFonts w:ascii="Arial" w:cs="Arial" w:eastAsia="Arial" w:hAnsi="Arial"/>
+                <w:b w:val="false"/>
+                <w:bCs w:val="false"/>
+                <w:color w:val="2E3A67"/>
+                <w:sz w:val="21"/>
+                <w:szCs w:val="21"/>
+              </w:rPr>
+              <w:t xml:space="preserve">. Chỉ thị 31/CT-TTg ngày 05/8/2026</w:t>
+            </w:r>
+          </w:p>
+        </w:tc>
+        <w:tc>
+          <w:tcPr>
+            <w:tcW w:type="dxa" w:w="3738"/>
+            <w:tcBorders>
+              <w:top w:val="none" w:color="FFFFFF" w:sz="0"/>
+              <w:left w:val="none" w:color="FFFFFF" w:sz="0"/>
+              <w:bottom w:val="single" w:color="D5DAE6" w:sz="4"/>
+              <w:right w:val="none" w:color="FFFFFF" w:sz="0"/>
+            </w:tcBorders>
+            <w:shd w:fill="FFFFFF" w:color="auto" w:val="clear"/>
+            <w:tcMar>
+              <w:top w:type="dxa" w:w="100"/>
+              <w:left w:type="dxa" w:w="160"/>
+              <w:bottom w:type="dxa" w:w="100"/>
+              <w:right w:type="dxa" w:w="160"/>
+            </w:tcMar>
+          </w:tcPr>
+          <w:p>
+            <w:r>
+              <w:rPr>
+                <w:rFonts w:ascii="Arial" w:cs="Arial" w:eastAsia="Arial" w:hAnsi="Arial"/>
+                <w:b w:val="false"/>
+                <w:bCs w:val="false"/>
+                <w:color w:val="2E3A67"/>
+                <w:sz w:val="21"/>
+                <w:szCs w:val="21"/>
+              </w:rPr>
+              <w:t xml:space="preserve">Đẩy mạnh chuyển đổi số, ứng dụng AI có kiểm soát; mở rộng giáo dục STEM/STEAM, kỹ năng số.</w:t>
+            </w:r>
+          </w:p>
+        </w:tc>
+        <w:tc>
+          <w:tcPr>
+            <w:tcW w:type="dxa" w:w="2400"/>
+            <w:tcBorders>
+              <w:top w:val="none" w:color="FFFFFF" w:sz="0"/>
+              <w:left w:val="none" w:color="FFFFFF" w:sz="0"/>
+              <w:bottom w:val="single" w:color="D5DAE6" w:sz="4"/>
+              <w:right w:val="none" w:color="FFFFFF" w:sz="0"/>
+            </w:tcBorders>
+            <w:shd w:fill="FFFFFF" w:color="auto" w:val="clear"/>
+            <w:tcMar>
+              <w:top w:type="dxa" w:w="100"/>
+              <w:left w:type="dxa" w:w="160"/>
+              <w:bottom w:type="dxa" w:w="100"/>
+              <w:right w:type="dxa" w:w="160"/>
+            </w:tcMar>
+          </w:tcPr>
+          <w:p>
+            <w:r>
+              <w:rPr>
+                <w:rFonts w:ascii="Arial" w:cs="Arial" w:eastAsia="Arial" w:hAnsi="Arial"/>
+                <w:b w:val="false"/>
+                <w:bCs w:val="false"/>
+                <w:color w:val="2E3A67"/>
+                <w:sz w:val="21"/>
+                <w:szCs w:val="21"/>
+              </w:rPr>
+              <w:t xml:space="preserve">Bài 12 (tr. 29), toàn bộ sách</w:t>
             </w:r>
           </w:p>
         </w:tc>
@@ -5604,7 +5856,7 @@
           <w:sz w:val="26"/>
           <w:szCs w:val="26"/>
         </w:rPr>
-        <w:t xml:space="preserve">Luật mới có hiệu lực năm 2026</w:t>
+        <w:t xml:space="preserve">Văn bản chuyên môn của Bộ GDĐT đang áp dụng khi soạn bài, ra đề</w:t>
       </w:r>
     </w:p>
     <w:tbl>
@@ -5754,18 +6006,18 @@
                 <w:sz w:val="21"/>
                 <w:szCs w:val="21"/>
               </w:rPr>
-              <w:t xml:space="preserve">Luật Trí tuệ nhân tạo</w:t>
-            </w:r>
-            <w:r>
-              <w:rPr>
-                <w:rFonts w:ascii="Arial" w:cs="Arial" w:eastAsia="Arial" w:hAnsi="Arial"/>
-                <w:b w:val="false"/>
-                <w:bCs w:val="false"/>
-                <w:color w:val="2E3A67"/>
-                <w:sz w:val="21"/>
-                <w:szCs w:val="21"/>
-              </w:rPr>
-              <w:t xml:space="preserve">. Luật số 134/2025/QH15, thông qua 10/12/2025, hiệu lực 01/3/2026</w:t>
+              <w:t xml:space="preserve">Chương trình giáo dục phổ thông</w:t>
+            </w:r>
+            <w:r>
+              <w:rPr>
+                <w:rFonts w:ascii="Arial" w:cs="Arial" w:eastAsia="Arial" w:hAnsi="Arial"/>
+                <w:b w:val="false"/>
+                <w:bCs w:val="false"/>
+                <w:color w:val="2E3A67"/>
+                <w:sz w:val="21"/>
+                <w:szCs w:val="21"/>
+              </w:rPr>
+              <w:t xml:space="preserve">. Thông tư 32/2018/TT-BGDĐT (chương trình đang áp dụng)</w:t>
             </w:r>
           </w:p>
         </w:tc>
@@ -5796,7 +6048,7 @@
                 <w:sz w:val="21"/>
                 <w:szCs w:val="21"/>
               </w:rPr>
-              <w:t xml:space="preserve">AI là công cụ hỗ trợ, con người quyết định cuối cùng. Nội dung do AI tạo ra cần có dấu hiệu nhận biết.</w:t>
+              <w:t xml:space="preserve">Nội dung, yêu cầu cần đạt của môn học khi soạn bài và ra đề.</w:t>
             </w:r>
           </w:p>
         </w:tc>
@@ -5827,7 +6079,7 @@
                 <w:sz w:val="21"/>
                 <w:szCs w:val="21"/>
               </w:rPr>
-              <w:t xml:space="preserve">Bài 1 (tr. 9), Phần 4 (trang 39), Phần 6 (trang 65)</w:t>
+              <w:t xml:space="preserve">Phần 2 (trang 15), Phần 3 (trang 27)</w:t>
             </w:r>
           </w:p>
         </w:tc>
@@ -5863,18 +6115,18 @@
                 <w:sz w:val="21"/>
                 <w:szCs w:val="21"/>
               </w:rPr>
-              <w:t xml:space="preserve">Luật Bảo vệ dữ liệu cá nhân</w:t>
-            </w:r>
-            <w:r>
-              <w:rPr>
-                <w:rFonts w:ascii="Arial" w:cs="Arial" w:eastAsia="Arial" w:hAnsi="Arial"/>
-                <w:b w:val="false"/>
-                <w:bCs w:val="false"/>
-                <w:color w:val="2E3A67"/>
-                <w:sz w:val="21"/>
-                <w:szCs w:val="21"/>
-              </w:rPr>
-              <w:t xml:space="preserve">. Luật số 91/2025/QH15, thông qua 26/6/2025, hiệu lực 01/1/2026</w:t>
+              <w:t xml:space="preserve">Chương trình giáo dục mầm non</w:t>
+            </w:r>
+            <w:r>
+              <w:rPr>
+                <w:rFonts w:ascii="Arial" w:cs="Arial" w:eastAsia="Arial" w:hAnsi="Arial"/>
+                <w:b w:val="false"/>
+                <w:bCs w:val="false"/>
+                <w:color w:val="2E3A67"/>
+                <w:sz w:val="21"/>
+                <w:szCs w:val="21"/>
+              </w:rPr>
+              <w:t xml:space="preserve">. Văn bản hợp nhất 01/VBHN-BGDĐT ngày 13/4/2021</w:t>
             </w:r>
           </w:p>
         </w:tc>
@@ -5905,7 +6157,7 @@
                 <w:sz w:val="21"/>
                 <w:szCs w:val="21"/>
               </w:rPr>
-              <w:t xml:space="preserve">Không đưa dữ liệu cá nhân của học sinh vào công cụ AI.</w:t>
+              <w:t xml:space="preserve">Câu lệnh cho Mầm non theo hoạt động chơi, trải nghiệm.</w:t>
             </w:r>
           </w:p>
         </w:tc>
@@ -5936,7 +6188,552 @@
                 <w:sz w:val="21"/>
                 <w:szCs w:val="21"/>
               </w:rPr>
-              <w:t xml:space="preserve">Bài 31 (tr. 59) đến Bài 33 (tr. 63), Bài 35 (tr. 67)</w:t>
+              <w:t xml:space="preserve">Dòng Mầm non ở mọi bảng Đổi cho lớp</w:t>
+            </w:r>
+          </w:p>
+        </w:tc>
+      </w:tr>
+      <w:tr>
+        <w:trPr>
+          <w:cantSplit/>
+        </w:trPr>
+        <w:tc>
+          <w:tcPr>
+            <w:tcW w:type="dxa" w:w="3500"/>
+            <w:tcBorders>
+              <w:top w:val="none" w:color="FFFFFF" w:sz="0"/>
+              <w:left w:val="none" w:color="FFFFFF" w:sz="0"/>
+              <w:bottom w:val="single" w:color="D5DAE6" w:sz="4"/>
+              <w:right w:val="none" w:color="FFFFFF" w:sz="0"/>
+            </w:tcBorders>
+            <w:shd w:fill="EEF0F6" w:color="auto" w:val="clear"/>
+            <w:tcMar>
+              <w:top w:type="dxa" w:w="100"/>
+              <w:left w:type="dxa" w:w="160"/>
+              <w:bottom w:type="dxa" w:w="100"/>
+              <w:right w:type="dxa" w:w="160"/>
+            </w:tcMar>
+          </w:tcPr>
+          <w:p>
+            <w:r>
+              <w:rPr>
+                <w:rFonts w:ascii="Arial" w:cs="Arial" w:eastAsia="Arial" w:hAnsi="Arial"/>
+                <w:b/>
+                <w:bCs/>
+                <w:color w:val="2E3A67"/>
+                <w:sz w:val="21"/>
+                <w:szCs w:val="21"/>
+              </w:rPr>
+              <w:t xml:space="preserve">Khung năng lực số cho người học</w:t>
+            </w:r>
+            <w:r>
+              <w:rPr>
+                <w:rFonts w:ascii="Arial" w:cs="Arial" w:eastAsia="Arial" w:hAnsi="Arial"/>
+                <w:b w:val="false"/>
+                <w:bCs w:val="false"/>
+                <w:color w:val="2E3A67"/>
+                <w:sz w:val="21"/>
+                <w:szCs w:val="21"/>
+              </w:rPr>
+              <w:t xml:space="preserve">. Thông tư 02/2025/TT-BGDĐT ngày 24/01/2025</w:t>
+            </w:r>
+          </w:p>
+        </w:tc>
+        <w:tc>
+          <w:tcPr>
+            <w:tcW w:type="dxa" w:w="3738"/>
+            <w:tcBorders>
+              <w:top w:val="none" w:color="FFFFFF" w:sz="0"/>
+              <w:left w:val="none" w:color="FFFFFF" w:sz="0"/>
+              <w:bottom w:val="single" w:color="D5DAE6" w:sz="4"/>
+              <w:right w:val="none" w:color="FFFFFF" w:sz="0"/>
+            </w:tcBorders>
+            <w:shd w:fill="EEF0F6" w:color="auto" w:val="clear"/>
+            <w:tcMar>
+              <w:top w:type="dxa" w:w="100"/>
+              <w:left w:type="dxa" w:w="160"/>
+              <w:bottom w:type="dxa" w:w="100"/>
+              <w:right w:type="dxa" w:w="160"/>
+            </w:tcMar>
+          </w:tcPr>
+          <w:p>
+            <w:r>
+              <w:rPr>
+                <w:rFonts w:ascii="Arial" w:cs="Arial" w:eastAsia="Arial" w:hAnsi="Arial"/>
+                <w:b w:val="false"/>
+                <w:bCs w:val="false"/>
+                <w:color w:val="2E3A67"/>
+                <w:sz w:val="21"/>
+                <w:szCs w:val="21"/>
+              </w:rPr>
+              <w:t xml:space="preserve">Yêu cầu về năng lực số của học sinh khi cho học sinh dùng AI.</w:t>
+            </w:r>
+          </w:p>
+        </w:tc>
+        <w:tc>
+          <w:tcPr>
+            <w:tcW w:type="dxa" w:w="2400"/>
+            <w:tcBorders>
+              <w:top w:val="none" w:color="FFFFFF" w:sz="0"/>
+              <w:left w:val="none" w:color="FFFFFF" w:sz="0"/>
+              <w:bottom w:val="single" w:color="D5DAE6" w:sz="4"/>
+              <w:right w:val="none" w:color="FFFFFF" w:sz="0"/>
+            </w:tcBorders>
+            <w:shd w:fill="EEF0F6" w:color="auto" w:val="clear"/>
+            <w:tcMar>
+              <w:top w:type="dxa" w:w="100"/>
+              <w:left w:type="dxa" w:w="160"/>
+              <w:bottom w:type="dxa" w:w="100"/>
+              <w:right w:type="dxa" w:w="160"/>
+            </w:tcMar>
+          </w:tcPr>
+          <w:p>
+            <w:r>
+              <w:rPr>
+                <w:rFonts w:ascii="Arial" w:cs="Arial" w:eastAsia="Arial" w:hAnsi="Arial"/>
+                <w:b w:val="false"/>
+                <w:bCs w:val="false"/>
+                <w:color w:val="2E3A67"/>
+                <w:sz w:val="21"/>
+                <w:szCs w:val="21"/>
+              </w:rPr>
+              <w:t xml:space="preserve">Bài 31 (tr. 60), Bài 32 (tr. 63)</w:t>
+            </w:r>
+          </w:p>
+        </w:tc>
+      </w:tr>
+      <w:tr>
+        <w:trPr>
+          <w:cantSplit/>
+        </w:trPr>
+        <w:tc>
+          <w:tcPr>
+            <w:tcW w:type="dxa" w:w="3500"/>
+            <w:tcBorders>
+              <w:top w:val="none" w:color="FFFFFF" w:sz="0"/>
+              <w:left w:val="none" w:color="FFFFFF" w:sz="0"/>
+              <w:bottom w:val="single" w:color="D5DAE6" w:sz="4"/>
+              <w:right w:val="none" w:color="FFFFFF" w:sz="0"/>
+            </w:tcBorders>
+            <w:shd w:fill="FFFFFF" w:color="auto" w:val="clear"/>
+            <w:tcMar>
+              <w:top w:type="dxa" w:w="100"/>
+              <w:left w:type="dxa" w:w="160"/>
+              <w:bottom w:type="dxa" w:w="100"/>
+              <w:right w:type="dxa" w:w="160"/>
+            </w:tcMar>
+          </w:tcPr>
+          <w:p>
+            <w:r>
+              <w:rPr>
+                <w:rFonts w:ascii="Arial" w:cs="Arial" w:eastAsia="Arial" w:hAnsi="Arial"/>
+                <w:b/>
+                <w:bCs/>
+                <w:color w:val="2E3A67"/>
+                <w:sz w:val="21"/>
+                <w:szCs w:val="21"/>
+              </w:rPr>
+              <w:t xml:space="preserve">Triển khai tài liệu Hướng dẫn sử dụng ứng dụng AI trong dạy và học</w:t>
+            </w:r>
+            <w:r>
+              <w:rPr>
+                <w:rFonts w:ascii="Arial" w:cs="Arial" w:eastAsia="Arial" w:hAnsi="Arial"/>
+                <w:b w:val="false"/>
+                <w:bCs w:val="false"/>
+                <w:color w:val="2E3A67"/>
+                <w:sz w:val="21"/>
+                <w:szCs w:val="21"/>
+              </w:rPr>
+              <w:t xml:space="preserve">. Công văn 2250/BGDĐT-GDPT ngày 12/5/2025</w:t>
+            </w:r>
+          </w:p>
+        </w:tc>
+        <w:tc>
+          <w:tcPr>
+            <w:tcW w:type="dxa" w:w="3738"/>
+            <w:tcBorders>
+              <w:top w:val="none" w:color="FFFFFF" w:sz="0"/>
+              <w:left w:val="none" w:color="FFFFFF" w:sz="0"/>
+              <w:bottom w:val="single" w:color="D5DAE6" w:sz="4"/>
+              <w:right w:val="none" w:color="FFFFFF" w:sz="0"/>
+            </w:tcBorders>
+            <w:shd w:fill="FFFFFF" w:color="auto" w:val="clear"/>
+            <w:tcMar>
+              <w:top w:type="dxa" w:w="100"/>
+              <w:left w:type="dxa" w:w="160"/>
+              <w:bottom w:type="dxa" w:w="100"/>
+              <w:right w:type="dxa" w:w="160"/>
+            </w:tcMar>
+          </w:tcPr>
+          <w:p>
+            <w:r>
+              <w:rPr>
+                <w:rFonts w:ascii="Arial" w:cs="Arial" w:eastAsia="Arial" w:hAnsi="Arial"/>
+                <w:b w:val="false"/>
+                <w:bCs w:val="false"/>
+                <w:color w:val="2E3A67"/>
+                <w:sz w:val="21"/>
+                <w:szCs w:val="21"/>
+              </w:rPr>
+              <w:t xml:space="preserve">Dùng AI để nâng hiệu quả, chất lượng dạy và học.</w:t>
+            </w:r>
+          </w:p>
+        </w:tc>
+        <w:tc>
+          <w:tcPr>
+            <w:tcW w:type="dxa" w:w="2400"/>
+            <w:tcBorders>
+              <w:top w:val="none" w:color="FFFFFF" w:sz="0"/>
+              <w:left w:val="none" w:color="FFFFFF" w:sz="0"/>
+              <w:bottom w:val="single" w:color="D5DAE6" w:sz="4"/>
+              <w:right w:val="none" w:color="FFFFFF" w:sz="0"/>
+            </w:tcBorders>
+            <w:shd w:fill="FFFFFF" w:color="auto" w:val="clear"/>
+            <w:tcMar>
+              <w:top w:type="dxa" w:w="100"/>
+              <w:left w:type="dxa" w:w="160"/>
+              <w:bottom w:type="dxa" w:w="100"/>
+              <w:right w:type="dxa" w:w="160"/>
+            </w:tcMar>
+          </w:tcPr>
+          <w:p>
+            <w:r>
+              <w:rPr>
+                <w:rFonts w:ascii="Arial" w:cs="Arial" w:eastAsia="Arial" w:hAnsi="Arial"/>
+                <w:b w:val="false"/>
+                <w:bCs w:val="false"/>
+                <w:color w:val="2E3A67"/>
+                <w:sz w:val="21"/>
+                <w:szCs w:val="21"/>
+              </w:rPr>
+              <w:t xml:space="preserve">Toàn bộ sách</w:t>
+            </w:r>
+          </w:p>
+        </w:tc>
+      </w:tr>
+      <w:tr>
+        <w:trPr>
+          <w:cantSplit/>
+        </w:trPr>
+        <w:tc>
+          <w:tcPr>
+            <w:tcW w:type="dxa" w:w="3500"/>
+            <w:tcBorders>
+              <w:top w:val="none" w:color="FFFFFF" w:sz="0"/>
+              <w:left w:val="none" w:color="FFFFFF" w:sz="0"/>
+              <w:bottom w:val="single" w:color="D5DAE6" w:sz="4"/>
+              <w:right w:val="none" w:color="FFFFFF" w:sz="0"/>
+            </w:tcBorders>
+            <w:shd w:fill="EEF0F6" w:color="auto" w:val="clear"/>
+            <w:tcMar>
+              <w:top w:type="dxa" w:w="100"/>
+              <w:left w:type="dxa" w:w="160"/>
+              <w:bottom w:type="dxa" w:w="100"/>
+              <w:right w:type="dxa" w:w="160"/>
+            </w:tcMar>
+          </w:tcPr>
+          <w:p>
+            <w:r>
+              <w:rPr>
+                <w:rFonts w:ascii="Arial" w:cs="Arial" w:eastAsia="Arial" w:hAnsi="Arial"/>
+                <w:b/>
+                <w:bCs/>
+                <w:color w:val="2E3A67"/>
+                <w:sz w:val="21"/>
+                <w:szCs w:val="21"/>
+              </w:rPr>
+              <w:t xml:space="preserve">Hướng dẫn kiểm tra, đánh giá cấp THCS, THPT</w:t>
+            </w:r>
+            <w:r>
+              <w:rPr>
+                <w:rFonts w:ascii="Arial" w:cs="Arial" w:eastAsia="Arial" w:hAnsi="Arial"/>
+                <w:b w:val="false"/>
+                <w:bCs w:val="false"/>
+                <w:color w:val="2E3A67"/>
+                <w:sz w:val="21"/>
+                <w:szCs w:val="21"/>
+              </w:rPr>
+              <w:t xml:space="preserve">. Công văn 7991/BGDĐT-GDTrH ngày 17/12/2024</w:t>
+            </w:r>
+          </w:p>
+        </w:tc>
+        <w:tc>
+          <w:tcPr>
+            <w:tcW w:type="dxa" w:w="3738"/>
+            <w:tcBorders>
+              <w:top w:val="none" w:color="FFFFFF" w:sz="0"/>
+              <w:left w:val="none" w:color="FFFFFF" w:sz="0"/>
+              <w:bottom w:val="single" w:color="D5DAE6" w:sz="4"/>
+              <w:right w:val="none" w:color="FFFFFF" w:sz="0"/>
+            </w:tcBorders>
+            <w:shd w:fill="EEF0F6" w:color="auto" w:val="clear"/>
+            <w:tcMar>
+              <w:top w:type="dxa" w:w="100"/>
+              <w:left w:type="dxa" w:w="160"/>
+              <w:bottom w:type="dxa" w:w="100"/>
+              <w:right w:type="dxa" w:w="160"/>
+            </w:tcMar>
+          </w:tcPr>
+          <w:p>
+            <w:r>
+              <w:rPr>
+                <w:rFonts w:ascii="Arial" w:cs="Arial" w:eastAsia="Arial" w:hAnsi="Arial"/>
+                <w:b w:val="false"/>
+                <w:bCs w:val="false"/>
+                <w:color w:val="2E3A67"/>
+                <w:sz w:val="21"/>
+                <w:szCs w:val="21"/>
+              </w:rPr>
+              <w:t xml:space="preserve">Đề định kỳ đi kèm ma trận, bản đặc tả, hướng dẫn chấm.</w:t>
+            </w:r>
+          </w:p>
+        </w:tc>
+        <w:tc>
+          <w:tcPr>
+            <w:tcW w:type="dxa" w:w="2400"/>
+            <w:tcBorders>
+              <w:top w:val="none" w:color="FFFFFF" w:sz="0"/>
+              <w:left w:val="none" w:color="FFFFFF" w:sz="0"/>
+              <w:bottom w:val="single" w:color="D5DAE6" w:sz="4"/>
+              <w:right w:val="none" w:color="FFFFFF" w:sz="0"/>
+            </w:tcBorders>
+            <w:shd w:fill="EEF0F6" w:color="auto" w:val="clear"/>
+            <w:tcMar>
+              <w:top w:type="dxa" w:w="100"/>
+              <w:left w:type="dxa" w:w="160"/>
+              <w:bottom w:type="dxa" w:w="100"/>
+              <w:right w:type="dxa" w:w="160"/>
+            </w:tcMar>
+          </w:tcPr>
+          <w:p>
+            <w:r>
+              <w:rPr>
+                <w:rFonts w:ascii="Arial" w:cs="Arial" w:eastAsia="Arial" w:hAnsi="Arial"/>
+                <w:b w:val="false"/>
+                <w:bCs w:val="false"/>
+                <w:color w:val="2E3A67"/>
+                <w:sz w:val="21"/>
+                <w:szCs w:val="21"/>
+              </w:rPr>
+              <w:t xml:space="preserve">Bài 15 (tr. 32), Bài 16 (tr. 34)</w:t>
+            </w:r>
+          </w:p>
+        </w:tc>
+      </w:tr>
+      <w:tr>
+        <w:trPr>
+          <w:cantSplit/>
+        </w:trPr>
+        <w:tc>
+          <w:tcPr>
+            <w:tcW w:type="dxa" w:w="3500"/>
+            <w:tcBorders>
+              <w:top w:val="none" w:color="FFFFFF" w:sz="0"/>
+              <w:left w:val="none" w:color="FFFFFF" w:sz="0"/>
+              <w:bottom w:val="single" w:color="D5DAE6" w:sz="4"/>
+              <w:right w:val="none" w:color="FFFFFF" w:sz="0"/>
+            </w:tcBorders>
+            <w:shd w:fill="FFFFFF" w:color="auto" w:val="clear"/>
+            <w:tcMar>
+              <w:top w:type="dxa" w:w="100"/>
+              <w:left w:type="dxa" w:w="160"/>
+              <w:bottom w:type="dxa" w:w="100"/>
+              <w:right w:type="dxa" w:w="160"/>
+            </w:tcMar>
+          </w:tcPr>
+          <w:p>
+            <w:r>
+              <w:rPr>
+                <w:rFonts w:ascii="Arial" w:cs="Arial" w:eastAsia="Arial" w:hAnsi="Arial"/>
+                <w:b/>
+                <w:bCs/>
+                <w:color w:val="2E3A67"/>
+                <w:sz w:val="21"/>
+                <w:szCs w:val="21"/>
+              </w:rPr>
+              <w:t xml:space="preserve">Đánh giá học sinh THCS, THPT</w:t>
+            </w:r>
+            <w:r>
+              <w:rPr>
+                <w:rFonts w:ascii="Arial" w:cs="Arial" w:eastAsia="Arial" w:hAnsi="Arial"/>
+                <w:b w:val="false"/>
+                <w:bCs w:val="false"/>
+                <w:color w:val="2E3A67"/>
+                <w:sz w:val="21"/>
+                <w:szCs w:val="21"/>
+              </w:rPr>
+              <w:t xml:space="preserve">. Thông tư 22/2021/TT-BGDĐT</w:t>
+            </w:r>
+          </w:p>
+        </w:tc>
+        <w:tc>
+          <w:tcPr>
+            <w:tcW w:type="dxa" w:w="3738"/>
+            <w:tcBorders>
+              <w:top w:val="none" w:color="FFFFFF" w:sz="0"/>
+              <w:left w:val="none" w:color="FFFFFF" w:sz="0"/>
+              <w:bottom w:val="single" w:color="D5DAE6" w:sz="4"/>
+              <w:right w:val="none" w:color="FFFFFF" w:sz="0"/>
+            </w:tcBorders>
+            <w:shd w:fill="FFFFFF" w:color="auto" w:val="clear"/>
+            <w:tcMar>
+              <w:top w:type="dxa" w:w="100"/>
+              <w:left w:type="dxa" w:w="160"/>
+              <w:bottom w:type="dxa" w:w="100"/>
+              <w:right w:type="dxa" w:w="160"/>
+            </w:tcMar>
+          </w:tcPr>
+          <w:p>
+            <w:r>
+              <w:rPr>
+                <w:rFonts w:ascii="Arial" w:cs="Arial" w:eastAsia="Arial" w:hAnsi="Arial"/>
+                <w:b w:val="false"/>
+                <w:bCs w:val="false"/>
+                <w:color w:val="2E3A67"/>
+                <w:sz w:val="21"/>
+                <w:szCs w:val="21"/>
+              </w:rPr>
+              <w:t xml:space="preserve">Đánh giá thường xuyên, định kỳ.</w:t>
+            </w:r>
+          </w:p>
+        </w:tc>
+        <w:tc>
+          <w:tcPr>
+            <w:tcW w:type="dxa" w:w="2400"/>
+            <w:tcBorders>
+              <w:top w:val="none" w:color="FFFFFF" w:sz="0"/>
+              <w:left w:val="none" w:color="FFFFFF" w:sz="0"/>
+              <w:bottom w:val="single" w:color="D5DAE6" w:sz="4"/>
+              <w:right w:val="none" w:color="FFFFFF" w:sz="0"/>
+            </w:tcBorders>
+            <w:shd w:fill="FFFFFF" w:color="auto" w:val="clear"/>
+            <w:tcMar>
+              <w:top w:type="dxa" w:w="100"/>
+              <w:left w:type="dxa" w:w="160"/>
+              <w:bottom w:type="dxa" w:w="100"/>
+              <w:right w:type="dxa" w:w="160"/>
+            </w:tcMar>
+          </w:tcPr>
+          <w:p>
+            <w:r>
+              <w:rPr>
+                <w:rFonts w:ascii="Arial" w:cs="Arial" w:eastAsia="Arial" w:hAnsi="Arial"/>
+                <w:b w:val="false"/>
+                <w:bCs w:val="false"/>
+                <w:color w:val="2E3A67"/>
+                <w:sz w:val="21"/>
+                <w:szCs w:val="21"/>
+              </w:rPr>
+              <w:t xml:space="preserve">Bài 13 (tr. 30) đến Bài 17 (tr. 36)</w:t>
+            </w:r>
+          </w:p>
+        </w:tc>
+      </w:tr>
+      <w:tr>
+        <w:trPr>
+          <w:cantSplit/>
+        </w:trPr>
+        <w:tc>
+          <w:tcPr>
+            <w:tcW w:type="dxa" w:w="3500"/>
+            <w:tcBorders>
+              <w:top w:val="none" w:color="FFFFFF" w:sz="0"/>
+              <w:left w:val="none" w:color="FFFFFF" w:sz="0"/>
+              <w:bottom w:val="single" w:color="D5DAE6" w:sz="4"/>
+              <w:right w:val="none" w:color="FFFFFF" w:sz="0"/>
+            </w:tcBorders>
+            <w:shd w:fill="EEF0F6" w:color="auto" w:val="clear"/>
+            <w:tcMar>
+              <w:top w:type="dxa" w:w="100"/>
+              <w:left w:type="dxa" w:w="160"/>
+              <w:bottom w:type="dxa" w:w="100"/>
+              <w:right w:type="dxa" w:w="160"/>
+            </w:tcMar>
+          </w:tcPr>
+          <w:p>
+            <w:r>
+              <w:rPr>
+                <w:rFonts w:ascii="Arial" w:cs="Arial" w:eastAsia="Arial" w:hAnsi="Arial"/>
+                <w:b/>
+                <w:bCs/>
+                <w:color w:val="2E3A67"/>
+                <w:sz w:val="21"/>
+                <w:szCs w:val="21"/>
+              </w:rPr>
+              <w:t xml:space="preserve">Đánh giá học sinh tiểu học</w:t>
+            </w:r>
+            <w:r>
+              <w:rPr>
+                <w:rFonts w:ascii="Arial" w:cs="Arial" w:eastAsia="Arial" w:hAnsi="Arial"/>
+                <w:b w:val="false"/>
+                <w:bCs w:val="false"/>
+                <w:color w:val="2E3A67"/>
+                <w:sz w:val="21"/>
+                <w:szCs w:val="21"/>
+              </w:rPr>
+              <w:t xml:space="preserve">. Thông tư 27/2020/TT-BGDĐT</w:t>
+            </w:r>
+          </w:p>
+        </w:tc>
+        <w:tc>
+          <w:tcPr>
+            <w:tcW w:type="dxa" w:w="3738"/>
+            <w:tcBorders>
+              <w:top w:val="none" w:color="FFFFFF" w:sz="0"/>
+              <w:left w:val="none" w:color="FFFFFF" w:sz="0"/>
+              <w:bottom w:val="single" w:color="D5DAE6" w:sz="4"/>
+              <w:right w:val="none" w:color="FFFFFF" w:sz="0"/>
+            </w:tcBorders>
+            <w:shd w:fill="EEF0F6" w:color="auto" w:val="clear"/>
+            <w:tcMar>
+              <w:top w:type="dxa" w:w="100"/>
+              <w:left w:type="dxa" w:w="160"/>
+              <w:bottom w:type="dxa" w:w="100"/>
+              <w:right w:type="dxa" w:w="160"/>
+            </w:tcMar>
+          </w:tcPr>
+          <w:p>
+            <w:r>
+              <w:rPr>
+                <w:rFonts w:ascii="Arial" w:cs="Arial" w:eastAsia="Arial" w:hAnsi="Arial"/>
+                <w:b w:val="false"/>
+                <w:bCs w:val="false"/>
+                <w:color w:val="2E3A67"/>
+                <w:sz w:val="21"/>
+                <w:szCs w:val="21"/>
+              </w:rPr>
+              <w:t xml:space="preserve">Đánh giá vì sự tiến bộ, kết hợp nhận xét và điểm số.</w:t>
+            </w:r>
+          </w:p>
+        </w:tc>
+        <w:tc>
+          <w:tcPr>
+            <w:tcW w:type="dxa" w:w="2400"/>
+            <w:tcBorders>
+              <w:top w:val="none" w:color="FFFFFF" w:sz="0"/>
+              <w:left w:val="none" w:color="FFFFFF" w:sz="0"/>
+              <w:bottom w:val="single" w:color="D5DAE6" w:sz="4"/>
+              <w:right w:val="none" w:color="FFFFFF" w:sz="0"/>
+            </w:tcBorders>
+            <w:shd w:fill="EEF0F6" w:color="auto" w:val="clear"/>
+            <w:tcMar>
+              <w:top w:type="dxa" w:w="100"/>
+              <w:left w:type="dxa" w:w="160"/>
+              <w:bottom w:type="dxa" w:w="100"/>
+              <w:right w:type="dxa" w:w="160"/>
+            </w:tcMar>
+          </w:tcPr>
+          <w:p>
+            <w:r>
+              <w:rPr>
+                <w:rFonts w:ascii="Arial" w:cs="Arial" w:eastAsia="Arial" w:hAnsi="Arial"/>
+                <w:b w:val="false"/>
+                <w:bCs w:val="false"/>
+                <w:color w:val="2E3A67"/>
+                <w:sz w:val="21"/>
+                <w:szCs w:val="21"/>
+              </w:rPr>
+              <w:t xml:space="preserve">Bài 14 (tr. 31), Bài 17 (tr. 36)</w:t>
             </w:r>
           </w:p>
         </w:tc>
@@ -5961,7 +6758,7 @@
           <w:sz w:val="26"/>
           <w:szCs w:val="26"/>
         </w:rPr>
-        <w:t xml:space="preserve">Hướng dẫn của ngành Giáo dục 2025-2026</w:t>
+        <w:t xml:space="preserve">Văn bản của Sở GDĐT</w:t>
       </w:r>
     </w:p>
     <w:tbl>
@@ -6111,18 +6908,18 @@
                 <w:sz w:val="21"/>
                 <w:szCs w:val="21"/>
               </w:rPr>
-              <w:t xml:space="preserve">Khung năng lực số cho người học</w:t>
-            </w:r>
-            <w:r>
-              <w:rPr>
-                <w:rFonts w:ascii="Arial" w:cs="Arial" w:eastAsia="Arial" w:hAnsi="Arial"/>
-                <w:b w:val="false"/>
-                <w:bCs w:val="false"/>
-                <w:color w:val="2E3A67"/>
-                <w:sz w:val="21"/>
-                <w:szCs w:val="21"/>
-              </w:rPr>
-              <w:t xml:space="preserve">. Thông tư 02/2025/TT-BGDĐT ngày 24/01/2025</w:t>
+              <w:t xml:space="preserve">Kế hoạch, hướng dẫn nhiệm vụ năm học 2026-2027 của Sở GDĐT nơi thầy cô công tác</w:t>
+            </w:r>
+            <w:r>
+              <w:rPr>
+                <w:rFonts w:ascii="Arial" w:cs="Arial" w:eastAsia="Arial" w:hAnsi="Arial"/>
+                <w:b w:val="false"/>
+                <w:bCs w:val="false"/>
+                <w:color w:val="2E3A67"/>
+                <w:sz w:val="21"/>
+                <w:szCs w:val="21"/>
+              </w:rPr>
+              <w:t xml:space="preserve">. Mỗi Sở ban hành riêng, dựa trên văn bản của Bộ</w:t>
             </w:r>
           </w:p>
         </w:tc>
@@ -6153,7 +6950,7 @@
                 <w:sz w:val="21"/>
                 <w:szCs w:val="21"/>
               </w:rPr>
-              <w:t xml:space="preserve">Học sinh dùng công nghệ và AI an toàn, có trách nhiệm.</w:t>
+              <w:t xml:space="preserve">Các Sở cụ thể hóa văn bản của Bộ cho địa phương, ví dụ Hà Nội triển khai giáo dục AI đồng bộ cho học sinh từ năm học 2026-2027. Thầy cô đối chiếu thêm văn bản của Sở mình.</w:t>
             </w:r>
           </w:p>
         </w:tc>
@@ -6184,443 +6981,7 @@
                 <w:sz w:val="21"/>
                 <w:szCs w:val="21"/>
               </w:rPr>
-              <w:t xml:space="preserve">Bài 31 (tr. 59), Bài 32 (tr. 62), Phần 6 (trang 65)</w:t>
-            </w:r>
-          </w:p>
-        </w:tc>
-      </w:tr>
-      <w:tr>
-        <w:trPr>
-          <w:cantSplit/>
-        </w:trPr>
-        <w:tc>
-          <w:tcPr>
-            <w:tcW w:type="dxa" w:w="3500"/>
-            <w:tcBorders>
-              <w:top w:val="none" w:color="FFFFFF" w:sz="0"/>
-              <w:left w:val="none" w:color="FFFFFF" w:sz="0"/>
-              <w:bottom w:val="single" w:color="D5DAE6" w:sz="4"/>
-              <w:right w:val="none" w:color="FFFFFF" w:sz="0"/>
-            </w:tcBorders>
-            <w:shd w:fill="FFFFFF" w:color="auto" w:val="clear"/>
-            <w:tcMar>
-              <w:top w:type="dxa" w:w="100"/>
-              <w:left w:type="dxa" w:w="160"/>
-              <w:bottom w:type="dxa" w:w="100"/>
-              <w:right w:type="dxa" w:w="160"/>
-            </w:tcMar>
-          </w:tcPr>
-          <w:p>
-            <w:r>
-              <w:rPr>
-                <w:rFonts w:ascii="Arial" w:cs="Arial" w:eastAsia="Arial" w:hAnsi="Arial"/>
-                <w:b/>
-                <w:bCs/>
-                <w:color w:val="2E3A67"/>
-                <w:sz w:val="21"/>
-                <w:szCs w:val="21"/>
-              </w:rPr>
-              <w:t xml:space="preserve">Triển khai tài liệu Hướng dẫn sử dụng ứng dụng AI trong dạy và học</w:t>
-            </w:r>
-            <w:r>
-              <w:rPr>
-                <w:rFonts w:ascii="Arial" w:cs="Arial" w:eastAsia="Arial" w:hAnsi="Arial"/>
-                <w:b w:val="false"/>
-                <w:bCs w:val="false"/>
-                <w:color w:val="2E3A67"/>
-                <w:sz w:val="21"/>
-                <w:szCs w:val="21"/>
-              </w:rPr>
-              <w:t xml:space="preserve">. Công văn 2250/BGDĐT-GDPT ngày 12/5/2025</w:t>
-            </w:r>
-          </w:p>
-        </w:tc>
-        <w:tc>
-          <w:tcPr>
-            <w:tcW w:type="dxa" w:w="3738"/>
-            <w:tcBorders>
-              <w:top w:val="none" w:color="FFFFFF" w:sz="0"/>
-              <w:left w:val="none" w:color="FFFFFF" w:sz="0"/>
-              <w:bottom w:val="single" w:color="D5DAE6" w:sz="4"/>
-              <w:right w:val="none" w:color="FFFFFF" w:sz="0"/>
-            </w:tcBorders>
-            <w:shd w:fill="FFFFFF" w:color="auto" w:val="clear"/>
-            <w:tcMar>
-              <w:top w:type="dxa" w:w="100"/>
-              <w:left w:type="dxa" w:w="160"/>
-              <w:bottom w:type="dxa" w:w="100"/>
-              <w:right w:type="dxa" w:w="160"/>
-            </w:tcMar>
-          </w:tcPr>
-          <w:p>
-            <w:r>
-              <w:rPr>
-                <w:rFonts w:ascii="Arial" w:cs="Arial" w:eastAsia="Arial" w:hAnsi="Arial"/>
-                <w:b w:val="false"/>
-                <w:bCs w:val="false"/>
-                <w:color w:val="2E3A67"/>
-                <w:sz w:val="21"/>
-                <w:szCs w:val="21"/>
-              </w:rPr>
-              <w:t xml:space="preserve">Dùng AI để nâng hiệu quả, chất lượng dạy và học.</w:t>
-            </w:r>
-          </w:p>
-        </w:tc>
-        <w:tc>
-          <w:tcPr>
-            <w:tcW w:type="dxa" w:w="2400"/>
-            <w:tcBorders>
-              <w:top w:val="none" w:color="FFFFFF" w:sz="0"/>
-              <w:left w:val="none" w:color="FFFFFF" w:sz="0"/>
-              <w:bottom w:val="single" w:color="D5DAE6" w:sz="4"/>
-              <w:right w:val="none" w:color="FFFFFF" w:sz="0"/>
-            </w:tcBorders>
-            <w:shd w:fill="FFFFFF" w:color="auto" w:val="clear"/>
-            <w:tcMar>
-              <w:top w:type="dxa" w:w="100"/>
-              <w:left w:type="dxa" w:w="160"/>
-              <w:bottom w:type="dxa" w:w="100"/>
-              <w:right w:type="dxa" w:w="160"/>
-            </w:tcMar>
-          </w:tcPr>
-          <w:p>
-            <w:r>
-              <w:rPr>
-                <w:rFonts w:ascii="Arial" w:cs="Arial" w:eastAsia="Arial" w:hAnsi="Arial"/>
-                <w:b w:val="false"/>
-                <w:bCs w:val="false"/>
-                <w:color w:val="2E3A67"/>
-                <w:sz w:val="21"/>
-                <w:szCs w:val="21"/>
-              </w:rPr>
               <w:t xml:space="preserve">Toàn bộ sách</w:t>
-            </w:r>
-          </w:p>
-        </w:tc>
-      </w:tr>
-      <w:tr>
-        <w:trPr>
-          <w:cantSplit/>
-        </w:trPr>
-        <w:tc>
-          <w:tcPr>
-            <w:tcW w:type="dxa" w:w="3500"/>
-            <w:tcBorders>
-              <w:top w:val="none" w:color="FFFFFF" w:sz="0"/>
-              <w:left w:val="none" w:color="FFFFFF" w:sz="0"/>
-              <w:bottom w:val="single" w:color="D5DAE6" w:sz="4"/>
-              <w:right w:val="none" w:color="FFFFFF" w:sz="0"/>
-            </w:tcBorders>
-            <w:shd w:fill="EEF0F6" w:color="auto" w:val="clear"/>
-            <w:tcMar>
-              <w:top w:type="dxa" w:w="100"/>
-              <w:left w:type="dxa" w:w="160"/>
-              <w:bottom w:type="dxa" w:w="100"/>
-              <w:right w:type="dxa" w:w="160"/>
-            </w:tcMar>
-          </w:tcPr>
-          <w:p>
-            <w:r>
-              <w:rPr>
-                <w:rFonts w:ascii="Arial" w:cs="Arial" w:eastAsia="Arial" w:hAnsi="Arial"/>
-                <w:b/>
-                <w:bCs/>
-                <w:color w:val="2E3A67"/>
-                <w:sz w:val="21"/>
-                <w:szCs w:val="21"/>
-              </w:rPr>
-              <w:t xml:space="preserve">Hướng dẫn nhiệm vụ ứng dụng CNTT, chuyển đổi số năm học 2025-2026</w:t>
-            </w:r>
-            <w:r>
-              <w:rPr>
-                <w:rFonts w:ascii="Arial" w:cs="Arial" w:eastAsia="Arial" w:hAnsi="Arial"/>
-                <w:b w:val="false"/>
-                <w:bCs w:val="false"/>
-                <w:color w:val="2E3A67"/>
-                <w:sz w:val="21"/>
-                <w:szCs w:val="21"/>
-              </w:rPr>
-              <w:t xml:space="preserve">. Công văn 5835/BGDĐT-KHCNTT ngày 29/9/2025</w:t>
-            </w:r>
-          </w:p>
-        </w:tc>
-        <w:tc>
-          <w:tcPr>
-            <w:tcW w:type="dxa" w:w="3738"/>
-            <w:tcBorders>
-              <w:top w:val="none" w:color="FFFFFF" w:sz="0"/>
-              <w:left w:val="none" w:color="FFFFFF" w:sz="0"/>
-              <w:bottom w:val="single" w:color="D5DAE6" w:sz="4"/>
-              <w:right w:val="none" w:color="FFFFFF" w:sz="0"/>
-            </w:tcBorders>
-            <w:shd w:fill="EEF0F6" w:color="auto" w:val="clear"/>
-            <w:tcMar>
-              <w:top w:type="dxa" w:w="100"/>
-              <w:left w:type="dxa" w:w="160"/>
-              <w:bottom w:type="dxa" w:w="100"/>
-              <w:right w:type="dxa" w:w="160"/>
-            </w:tcMar>
-          </w:tcPr>
-          <w:p>
-            <w:r>
-              <w:rPr>
-                <w:rFonts w:ascii="Arial" w:cs="Arial" w:eastAsia="Arial" w:hAnsi="Arial"/>
-                <w:b w:val="false"/>
-                <w:bCs w:val="false"/>
-                <w:color w:val="2E3A67"/>
-                <w:sz w:val="21"/>
-                <w:szCs w:val="21"/>
-              </w:rPr>
-              <w:t xml:space="preserve">Bồi dưỡng giáo viên về ứng dụng AI, STEM/STEAM.</w:t>
-            </w:r>
-          </w:p>
-        </w:tc>
-        <w:tc>
-          <w:tcPr>
-            <w:tcW w:type="dxa" w:w="2400"/>
-            <w:tcBorders>
-              <w:top w:val="none" w:color="FFFFFF" w:sz="0"/>
-              <w:left w:val="none" w:color="FFFFFF" w:sz="0"/>
-              <w:bottom w:val="single" w:color="D5DAE6" w:sz="4"/>
-              <w:right w:val="none" w:color="FFFFFF" w:sz="0"/>
-            </w:tcBorders>
-            <w:shd w:fill="EEF0F6" w:color="auto" w:val="clear"/>
-            <w:tcMar>
-              <w:top w:type="dxa" w:w="100"/>
-              <w:left w:type="dxa" w:w="160"/>
-              <w:bottom w:type="dxa" w:w="100"/>
-              <w:right w:type="dxa" w:w="160"/>
-            </w:tcMar>
-          </w:tcPr>
-          <w:p>
-            <w:r>
-              <w:rPr>
-                <w:rFonts w:ascii="Arial" w:cs="Arial" w:eastAsia="Arial" w:hAnsi="Arial"/>
-                <w:b w:val="false"/>
-                <w:bCs w:val="false"/>
-                <w:color w:val="2E3A67"/>
-                <w:sz w:val="21"/>
-                <w:szCs w:val="21"/>
-              </w:rPr>
-              <w:t xml:space="preserve">Bài 10 (tr. 24), Bài 12 (tr. 28), Phần 5 (trang 54)</w:t>
-            </w:r>
-          </w:p>
-        </w:tc>
-      </w:tr>
-      <w:tr>
-        <w:trPr>
-          <w:cantSplit/>
-        </w:trPr>
-        <w:tc>
-          <w:tcPr>
-            <w:tcW w:type="dxa" w:w="3500"/>
-            <w:tcBorders>
-              <w:top w:val="none" w:color="FFFFFF" w:sz="0"/>
-              <w:left w:val="none" w:color="FFFFFF" w:sz="0"/>
-              <w:bottom w:val="single" w:color="D5DAE6" w:sz="4"/>
-              <w:right w:val="none" w:color="FFFFFF" w:sz="0"/>
-            </w:tcBorders>
-            <w:shd w:fill="FFFFFF" w:color="auto" w:val="clear"/>
-            <w:tcMar>
-              <w:top w:type="dxa" w:w="100"/>
-              <w:left w:type="dxa" w:w="160"/>
-              <w:bottom w:type="dxa" w:w="100"/>
-              <w:right w:type="dxa" w:w="160"/>
-            </w:tcMar>
-          </w:tcPr>
-          <w:p>
-            <w:r>
-              <w:rPr>
-                <w:rFonts w:ascii="Arial" w:cs="Arial" w:eastAsia="Arial" w:hAnsi="Arial"/>
-                <w:b/>
-                <w:bCs/>
-                <w:color w:val="2E3A67"/>
-                <w:sz w:val="21"/>
-                <w:szCs w:val="21"/>
-              </w:rPr>
-              <w:t xml:space="preserve">Khung nội dung thí điểm giáo dục AI cho học sinh phổ thông</w:t>
-            </w:r>
-            <w:r>
-              <w:rPr>
-                <w:rFonts w:ascii="Arial" w:cs="Arial" w:eastAsia="Arial" w:hAnsi="Arial"/>
-                <w:b w:val="false"/>
-                <w:bCs w:val="false"/>
-                <w:color w:val="2E3A67"/>
-                <w:sz w:val="21"/>
-                <w:szCs w:val="21"/>
-              </w:rPr>
-              <w:t xml:space="preserve">. Quyết định 3439/QĐ-BGDĐT ngày 15/12/2025</w:t>
-            </w:r>
-          </w:p>
-        </w:tc>
-        <w:tc>
-          <w:tcPr>
-            <w:tcW w:type="dxa" w:w="3738"/>
-            <w:tcBorders>
-              <w:top w:val="none" w:color="FFFFFF" w:sz="0"/>
-              <w:left w:val="none" w:color="FFFFFF" w:sz="0"/>
-              <w:bottom w:val="single" w:color="D5DAE6" w:sz="4"/>
-              <w:right w:val="none" w:color="FFFFFF" w:sz="0"/>
-            </w:tcBorders>
-            <w:shd w:fill="FFFFFF" w:color="auto" w:val="clear"/>
-            <w:tcMar>
-              <w:top w:type="dxa" w:w="100"/>
-              <w:left w:type="dxa" w:w="160"/>
-              <w:bottom w:type="dxa" w:w="100"/>
-              <w:right w:type="dxa" w:w="160"/>
-            </w:tcMar>
-          </w:tcPr>
-          <w:p>
-            <w:r>
-              <w:rPr>
-                <w:rFonts w:ascii="Arial" w:cs="Arial" w:eastAsia="Arial" w:hAnsi="Arial"/>
-                <w:b w:val="false"/>
-                <w:bCs w:val="false"/>
-                <w:color w:val="2E3A67"/>
-                <w:sz w:val="21"/>
-                <w:szCs w:val="21"/>
-              </w:rPr>
-              <w:t xml:space="preserve">Bốn mạch: tư duy lấy con người làm trung tâm, đạo đức AI, kỹ thuật và ứng dụng AI, thiết kế hệ thống AI.</w:t>
-            </w:r>
-          </w:p>
-        </w:tc>
-        <w:tc>
-          <w:tcPr>
-            <w:tcW w:type="dxa" w:w="2400"/>
-            <w:tcBorders>
-              <w:top w:val="none" w:color="FFFFFF" w:sz="0"/>
-              <w:left w:val="none" w:color="FFFFFF" w:sz="0"/>
-              <w:bottom w:val="single" w:color="D5DAE6" w:sz="4"/>
-              <w:right w:val="none" w:color="FFFFFF" w:sz="0"/>
-            </w:tcBorders>
-            <w:shd w:fill="FFFFFF" w:color="auto" w:val="clear"/>
-            <w:tcMar>
-              <w:top w:type="dxa" w:w="100"/>
-              <w:left w:type="dxa" w:w="160"/>
-              <w:bottom w:type="dxa" w:w="100"/>
-              <w:right w:type="dxa" w:w="160"/>
-            </w:tcMar>
-          </w:tcPr>
-          <w:p>
-            <w:r>
-              <w:rPr>
-                <w:rFonts w:ascii="Arial" w:cs="Arial" w:eastAsia="Arial" w:hAnsi="Arial"/>
-                <w:b w:val="false"/>
-                <w:bCs w:val="false"/>
-                <w:color w:val="2E3A67"/>
-                <w:sz w:val="21"/>
-                <w:szCs w:val="21"/>
-              </w:rPr>
-              <w:t xml:space="preserve">Bài 34 (tr. 66)</w:t>
-            </w:r>
-          </w:p>
-        </w:tc>
-      </w:tr>
-      <w:tr>
-        <w:trPr>
-          <w:cantSplit/>
-        </w:trPr>
-        <w:tc>
-          <w:tcPr>
-            <w:tcW w:type="dxa" w:w="3500"/>
-            <w:tcBorders>
-              <w:top w:val="none" w:color="FFFFFF" w:sz="0"/>
-              <w:left w:val="none" w:color="FFFFFF" w:sz="0"/>
-              <w:bottom w:val="single" w:color="D5DAE6" w:sz="4"/>
-              <w:right w:val="none" w:color="FFFFFF" w:sz="0"/>
-            </w:tcBorders>
-            <w:shd w:fill="EEF0F6" w:color="auto" w:val="clear"/>
-            <w:tcMar>
-              <w:top w:type="dxa" w:w="100"/>
-              <w:left w:type="dxa" w:w="160"/>
-              <w:bottom w:type="dxa" w:w="100"/>
-              <w:right w:type="dxa" w:w="160"/>
-            </w:tcMar>
-          </w:tcPr>
-          <w:p>
-            <w:r>
-              <w:rPr>
-                <w:rFonts w:ascii="Arial" w:cs="Arial" w:eastAsia="Arial" w:hAnsi="Arial"/>
-                <w:b/>
-                <w:bCs/>
-                <w:color w:val="2E3A67"/>
-                <w:sz w:val="21"/>
-                <w:szCs w:val="21"/>
-              </w:rPr>
-              <w:t xml:space="preserve">Khung năng lực AI cho giáo viên (UNESCO)</w:t>
-            </w:r>
-            <w:r>
-              <w:rPr>
-                <w:rFonts w:ascii="Arial" w:cs="Arial" w:eastAsia="Arial" w:hAnsi="Arial"/>
-                <w:b w:val="false"/>
-                <w:bCs w:val="false"/>
-                <w:color w:val="2E3A67"/>
-                <w:sz w:val="21"/>
-                <w:szCs w:val="21"/>
-              </w:rPr>
-              <w:t xml:space="preserve">. UNESCO, 2024</w:t>
-            </w:r>
-          </w:p>
-        </w:tc>
-        <w:tc>
-          <w:tcPr>
-            <w:tcW w:type="dxa" w:w="3738"/>
-            <w:tcBorders>
-              <w:top w:val="none" w:color="FFFFFF" w:sz="0"/>
-              <w:left w:val="none" w:color="FFFFFF" w:sz="0"/>
-              <w:bottom w:val="single" w:color="D5DAE6" w:sz="4"/>
-              <w:right w:val="none" w:color="FFFFFF" w:sz="0"/>
-            </w:tcBorders>
-            <w:shd w:fill="EEF0F6" w:color="auto" w:val="clear"/>
-            <w:tcMar>
-              <w:top w:type="dxa" w:w="100"/>
-              <w:left w:type="dxa" w:w="160"/>
-              <w:bottom w:type="dxa" w:w="100"/>
-              <w:right w:type="dxa" w:w="160"/>
-            </w:tcMar>
-          </w:tcPr>
-          <w:p>
-            <w:r>
-              <w:rPr>
-                <w:rFonts w:ascii="Arial" w:cs="Arial" w:eastAsia="Arial" w:hAnsi="Arial"/>
-                <w:b w:val="false"/>
-                <w:bCs w:val="false"/>
-                <w:color w:val="2E3A67"/>
-                <w:sz w:val="21"/>
-                <w:szCs w:val="21"/>
-              </w:rPr>
-              <w:t xml:space="preserve">5 lĩnh vực, 3 cấp độ năng lực AI của giáo viên.</w:t>
-            </w:r>
-          </w:p>
-        </w:tc>
-        <w:tc>
-          <w:tcPr>
-            <w:tcW w:type="dxa" w:w="2400"/>
-            <w:tcBorders>
-              <w:top w:val="none" w:color="FFFFFF" w:sz="0"/>
-              <w:left w:val="none" w:color="FFFFFF" w:sz="0"/>
-              <w:bottom w:val="single" w:color="D5DAE6" w:sz="4"/>
-              <w:right w:val="none" w:color="FFFFFF" w:sz="0"/>
-            </w:tcBorders>
-            <w:shd w:fill="EEF0F6" w:color="auto" w:val="clear"/>
-            <w:tcMar>
-              <w:top w:type="dxa" w:w="100"/>
-              <w:left w:type="dxa" w:w="160"/>
-              <w:bottom w:type="dxa" w:w="100"/>
-              <w:right w:type="dxa" w:w="160"/>
-            </w:tcMar>
-          </w:tcPr>
-          <w:p>
-            <w:r>
-              <w:rPr>
-                <w:rFonts w:ascii="Arial" w:cs="Arial" w:eastAsia="Arial" w:hAnsi="Arial"/>
-                <w:b w:val="false"/>
-                <w:bCs w:val="false"/>
-                <w:color w:val="2E3A67"/>
-                <w:sz w:val="21"/>
-                <w:szCs w:val="21"/>
-              </w:rPr>
-              <w:t xml:space="preserve">Bài 34 (tr. 66)</w:t>
             </w:r>
           </w:p>
         </w:tc>
@@ -6645,7 +7006,7 @@
           <w:sz w:val="26"/>
           <w:szCs w:val="26"/>
         </w:rPr>
-        <w:t xml:space="preserve">Văn bản chuyên môn đang áp dụng khi soạn bài, ra đề</w:t>
+        <w:t xml:space="preserve">Luật và định hướng quốc gia có liên quan</w:t>
       </w:r>
     </w:p>
     <w:tbl>
@@ -6795,18 +7156,18 @@
                 <w:sz w:val="21"/>
                 <w:szCs w:val="21"/>
               </w:rPr>
-              <w:t xml:space="preserve">Chương trình giáo dục phổ thông</w:t>
-            </w:r>
-            <w:r>
-              <w:rPr>
-                <w:rFonts w:ascii="Arial" w:cs="Arial" w:eastAsia="Arial" w:hAnsi="Arial"/>
-                <w:b w:val="false"/>
-                <w:bCs w:val="false"/>
-                <w:color w:val="2E3A67"/>
-                <w:sz w:val="21"/>
-                <w:szCs w:val="21"/>
-              </w:rPr>
-              <w:t xml:space="preserve">. Thông tư 32/2018/TT-BGDĐT (chương trình đang áp dụng)</w:t>
+              <w:t xml:space="preserve">Luật Trí tuệ nhân tạo</w:t>
+            </w:r>
+            <w:r>
+              <w:rPr>
+                <w:rFonts w:ascii="Arial" w:cs="Arial" w:eastAsia="Arial" w:hAnsi="Arial"/>
+                <w:b w:val="false"/>
+                <w:bCs w:val="false"/>
+                <w:color w:val="2E3A67"/>
+                <w:sz w:val="21"/>
+                <w:szCs w:val="21"/>
+              </w:rPr>
+              <w:t xml:space="preserve">. Luật số 134/2025/QH15, hiệu lực 01/3/2026</w:t>
             </w:r>
           </w:p>
         </w:tc>
@@ -6837,7 +7198,7 @@
                 <w:sz w:val="21"/>
                 <w:szCs w:val="21"/>
               </w:rPr>
-              <w:t xml:space="preserve">Nội dung, yêu cầu cần đạt khi soạn bài và ra đề.</w:t>
+              <w:t xml:space="preserve">AI là công cụ hỗ trợ, con người quyết định cuối cùng. Nội dung do AI tạo ra cần có dấu hiệu nhận biết.</w:t>
             </w:r>
           </w:p>
         </w:tc>
@@ -6868,7 +7229,7 @@
                 <w:sz w:val="21"/>
                 <w:szCs w:val="21"/>
               </w:rPr>
-              <w:t xml:space="preserve">Phần 2 (trang 14), Phần 3 (trang 26)</w:t>
+              <w:t xml:space="preserve">Bài 1 (tr. 10), Phần 4 (trang 40), Phần 6 (trang 66)</w:t>
             </w:r>
           </w:p>
         </w:tc>
@@ -6904,18 +7265,18 @@
                 <w:sz w:val="21"/>
                 <w:szCs w:val="21"/>
               </w:rPr>
-              <w:t xml:space="preserve">Chương trình giáo dục mầm non</w:t>
-            </w:r>
-            <w:r>
-              <w:rPr>
-                <w:rFonts w:ascii="Arial" w:cs="Arial" w:eastAsia="Arial" w:hAnsi="Arial"/>
-                <w:b w:val="false"/>
-                <w:bCs w:val="false"/>
-                <w:color w:val="2E3A67"/>
-                <w:sz w:val="21"/>
-                <w:szCs w:val="21"/>
-              </w:rPr>
-              <w:t xml:space="preserve">. Văn bản hợp nhất 01/VBHN-BGDĐT ngày 13/4/2021</w:t>
+              <w:t xml:space="preserve">Luật Bảo vệ dữ liệu cá nhân</w:t>
+            </w:r>
+            <w:r>
+              <w:rPr>
+                <w:rFonts w:ascii="Arial" w:cs="Arial" w:eastAsia="Arial" w:hAnsi="Arial"/>
+                <w:b w:val="false"/>
+                <w:bCs w:val="false"/>
+                <w:color w:val="2E3A67"/>
+                <w:sz w:val="21"/>
+                <w:szCs w:val="21"/>
+              </w:rPr>
+              <w:t xml:space="preserve">. Luật số 91/2025/QH15, hiệu lực 01/1/2026</w:t>
             </w:r>
           </w:p>
         </w:tc>
@@ -6946,7 +7307,7 @@
                 <w:sz w:val="21"/>
                 <w:szCs w:val="21"/>
               </w:rPr>
-              <w:t xml:space="preserve">Câu lệnh cho Mầm non theo hoạt động chơi, trải nghiệm.</w:t>
+              <w:t xml:space="preserve">Không đưa dữ liệu cá nhân của học sinh vào công cụ AI.</w:t>
             </w:r>
           </w:p>
         </w:tc>
@@ -6977,7 +7338,7 @@
                 <w:sz w:val="21"/>
                 <w:szCs w:val="21"/>
               </w:rPr>
-              <w:t xml:space="preserve">Dòng Mầm non trong mọi bảng Đổi cho lớp</w:t>
+              <w:t xml:space="preserve">Bài 31 (tr. 60) đến Bài 33 (tr. 64), Bài 35 (tr. 69)</w:t>
             </w:r>
           </w:p>
         </w:tc>
@@ -7013,18 +7374,18 @@
                 <w:sz w:val="21"/>
                 <w:szCs w:val="21"/>
               </w:rPr>
-              <w:t xml:space="preserve">Hướng dẫn kiểm tra, đánh giá cấp THCS, THPT</w:t>
-            </w:r>
-            <w:r>
-              <w:rPr>
-                <w:rFonts w:ascii="Arial" w:cs="Arial" w:eastAsia="Arial" w:hAnsi="Arial"/>
-                <w:b w:val="false"/>
-                <w:bCs w:val="false"/>
-                <w:color w:val="2E3A67"/>
-                <w:sz w:val="21"/>
-                <w:szCs w:val="21"/>
-              </w:rPr>
-              <w:t xml:space="preserve">. Công văn 7991/BGDĐT-GDTrH ngày 17/12/2024</w:t>
+              <w:t xml:space="preserve">Luật Sở hữu trí tuệ (sửa đổi 2022)</w:t>
+            </w:r>
+            <w:r>
+              <w:rPr>
+                <w:rFonts w:ascii="Arial" w:cs="Arial" w:eastAsia="Arial" w:hAnsi="Arial"/>
+                <w:b w:val="false"/>
+                <w:bCs w:val="false"/>
+                <w:color w:val="2E3A67"/>
+                <w:sz w:val="21"/>
+                <w:szCs w:val="21"/>
+              </w:rPr>
+              <w:t xml:space="preserve">. Điều 25: sử dụng tác phẩm không phải xin phép, không phải trả tiền</w:t>
             </w:r>
           </w:p>
         </w:tc>
@@ -7055,7 +7416,7 @@
                 <w:sz w:val="21"/>
                 <w:szCs w:val="21"/>
               </w:rPr>
-              <w:t xml:space="preserve">Đề định kỳ đi kèm ma trận, bản đặc tả, hướng dẫn chấm.</w:t>
+              <w:t xml:space="preserve">Dùng SGK, tài liệu để minh họa giảng dạy hợp lý, ghi tên tác giả và nguồn.</w:t>
             </w:r>
           </w:p>
         </w:tc>
@@ -7086,7 +7447,7 @@
                 <w:sz w:val="21"/>
                 <w:szCs w:val="21"/>
               </w:rPr>
-              <w:t xml:space="preserve">Bài 15 (tr. 31), Bài 16 (tr. 33)</w:t>
+              <w:t xml:space="preserve">Bài 14 (tr. 31), Bài 15 (tr. 32), Bài 31 (tr. 60), Bài 32 (tr. 63)</w:t>
             </w:r>
           </w:p>
         </w:tc>
@@ -7122,18 +7483,18 @@
                 <w:sz w:val="21"/>
                 <w:szCs w:val="21"/>
               </w:rPr>
-              <w:t xml:space="preserve">Đánh giá học sinh THCS, THPT</w:t>
-            </w:r>
-            <w:r>
-              <w:rPr>
-                <w:rFonts w:ascii="Arial" w:cs="Arial" w:eastAsia="Arial" w:hAnsi="Arial"/>
-                <w:b w:val="false"/>
-                <w:bCs w:val="false"/>
-                <w:color w:val="2E3A67"/>
-                <w:sz w:val="21"/>
-                <w:szCs w:val="21"/>
-              </w:rPr>
-              <w:t xml:space="preserve">. Thông tư 22/2021/TT-BGDĐT</w:t>
+              <w:t xml:space="preserve">Nghị quyết về đột phá phát triển giáo dục và đào tạo</w:t>
+            </w:r>
+            <w:r>
+              <w:rPr>
+                <w:rFonts w:ascii="Arial" w:cs="Arial" w:eastAsia="Arial" w:hAnsi="Arial"/>
+                <w:b w:val="false"/>
+                <w:bCs w:val="false"/>
+                <w:color w:val="2E3A67"/>
+                <w:sz w:val="21"/>
+                <w:szCs w:val="21"/>
+              </w:rPr>
+              <w:t xml:space="preserve">. Nghị quyết 71-NQ/TW ngày 22/8/2025 của Bộ Chính trị</w:t>
             </w:r>
           </w:p>
         </w:tc>
@@ -7164,7 +7525,7 @@
                 <w:sz w:val="21"/>
                 <w:szCs w:val="21"/>
               </w:rPr>
-              <w:t xml:space="preserve">Đánh giá thường xuyên, định kỳ.</w:t>
+              <w:t xml:space="preserve">Mục tiêu giáo dục đến 2030, 2035, 2045.</w:t>
             </w:r>
           </w:p>
         </w:tc>
@@ -7195,7 +7556,7 @@
                 <w:sz w:val="21"/>
                 <w:szCs w:val="21"/>
               </w:rPr>
-              <w:t xml:space="preserve">Bài 13 (tr. 29) đến Bài 17 (tr. 35)</w:t>
+              <w:t xml:space="preserve">Toàn bộ sách</w:t>
             </w:r>
           </w:p>
         </w:tc>
@@ -7231,18 +7592,18 @@
                 <w:sz w:val="21"/>
                 <w:szCs w:val="21"/>
               </w:rPr>
-              <w:t xml:space="preserve">Đánh giá học sinh tiểu học</w:t>
-            </w:r>
-            <w:r>
-              <w:rPr>
-                <w:rFonts w:ascii="Arial" w:cs="Arial" w:eastAsia="Arial" w:hAnsi="Arial"/>
-                <w:b w:val="false"/>
-                <w:bCs w:val="false"/>
-                <w:color w:val="2E3A67"/>
-                <w:sz w:val="21"/>
-                <w:szCs w:val="21"/>
-              </w:rPr>
-              <w:t xml:space="preserve">. Thông tư 27/2020/TT-BGDĐT</w:t>
+              <w:t xml:space="preserve">Chiến lược quốc gia về trí tuệ nhân tạo đến năm 2030, tầm nhìn 2045</w:t>
+            </w:r>
+            <w:r>
+              <w:rPr>
+                <w:rFonts w:ascii="Arial" w:cs="Arial" w:eastAsia="Arial" w:hAnsi="Arial"/>
+                <w:b w:val="false"/>
+                <w:bCs w:val="false"/>
+                <w:color w:val="2E3A67"/>
+                <w:sz w:val="21"/>
+                <w:szCs w:val="21"/>
+              </w:rPr>
+              <w:t xml:space="preserve">. Quyết định 1671/QĐ-TTg ngày 28/8/2026</w:t>
             </w:r>
           </w:p>
         </w:tc>
@@ -7273,7 +7634,7 @@
                 <w:sz w:val="21"/>
                 <w:szCs w:val="21"/>
               </w:rPr>
-              <w:t xml:space="preserve">Đánh giá vì sự tiến bộ, kết hợp nhận xét và điểm số.</w:t>
+              <w:t xml:space="preserve">Định hướng chuyển đổi AI quốc gia.</w:t>
             </w:r>
           </w:p>
         </w:tc>
@@ -7304,7 +7665,7 @@
                 <w:sz w:val="21"/>
                 <w:szCs w:val="21"/>
               </w:rPr>
-              <w:t xml:space="preserve">Bài 14 (tr. 30), Bài 17 (tr. 35)</w:t>
+              <w:t xml:space="preserve">Toàn bộ sách</w:t>
             </w:r>
           </w:p>
         </w:tc>
@@ -7340,18 +7701,18 @@
                 <w:sz w:val="21"/>
                 <w:szCs w:val="21"/>
               </w:rPr>
-              <w:t xml:space="preserve">Luật Sở hữu trí tuệ (sửa đổi 2022)</w:t>
-            </w:r>
-            <w:r>
-              <w:rPr>
-                <w:rFonts w:ascii="Arial" w:cs="Arial" w:eastAsia="Arial" w:hAnsi="Arial"/>
-                <w:b w:val="false"/>
-                <w:bCs w:val="false"/>
-                <w:color w:val="2E3A67"/>
-                <w:sz w:val="21"/>
-                <w:szCs w:val="21"/>
-              </w:rPr>
-              <w:t xml:space="preserve">. Điều 25: sử dụng tác phẩm không phải xin phép, không phải trả tiền</w:t>
+              <w:t xml:space="preserve">Khung năng lực AI cho giáo viên (UNESCO, tham khảo quốc tế)</w:t>
+            </w:r>
+            <w:r>
+              <w:rPr>
+                <w:rFonts w:ascii="Arial" w:cs="Arial" w:eastAsia="Arial" w:hAnsi="Arial"/>
+                <w:b w:val="false"/>
+                <w:bCs w:val="false"/>
+                <w:color w:val="2E3A67"/>
+                <w:sz w:val="21"/>
+                <w:szCs w:val="21"/>
+              </w:rPr>
+              <w:t xml:space="preserve">. UNESCO, 2024</w:t>
             </w:r>
           </w:p>
         </w:tc>
@@ -7382,7 +7743,7 @@
                 <w:sz w:val="21"/>
                 <w:szCs w:val="21"/>
               </w:rPr>
-              <w:t xml:space="preserve">Dùng SGK, tài liệu để minh họa giảng dạy hợp lý, ghi tên tác giả và nguồn.</w:t>
+              <w:t xml:space="preserve">5 lĩnh vực, 3 cấp độ năng lực AI của giáo viên.</w:t>
             </w:r>
           </w:p>
         </w:tc>
@@ -7413,7 +7774,7 @@
                 <w:sz w:val="21"/>
                 <w:szCs w:val="21"/>
               </w:rPr>
-              <w:t xml:space="preserve">Bài 14 (tr. 30), Bài 15 (tr. 31), Bài 31 (tr. 59), Bài 32 (tr. 62)</w:t>
+              <w:t xml:space="preserve">Bài 34 (tr. 67)</w:t>
             </w:r>
           </w:p>
         </w:tc>

</xml_diff>

<commit_message>
Bỏ toàn bộ dấu mũi tên trong tài liệu, hình minh họa và ảnh bán hàng
Co-Authored-By: Claude Opus 5.5 <noreply@anthropic.com>
Claude-Session: https://claude.ai/code/session_016W4H5FXW9gSiS33Aau8aSB
</commit_message>
<xml_diff>
--- a/BO-TAI-LIEU-GUI-KHACH/00-DOC-DAU-TIEN-Huong-dan-su-dung.docx
+++ b/BO-TAI-LIEU-GUI-KHACH/00-DOC-DAU-TIEN-Huong-dan-su-dung.docx
@@ -3143,7 +3143,7 @@
           <w:sz w:val="23"/>
           <w:szCs w:val="23"/>
         </w:rPr>
-        <w:t xml:space="preserve"> bấm ảnh đại diện ở góc → </w:t>
+        <w:t xml:space="preserve"> bấm ảnh đại diện ở góc màn hình, chọn </w:t>
       </w:r>
       <w:r>
         <w:rPr>
@@ -3163,7 +3163,7 @@
           <w:sz w:val="23"/>
           <w:szCs w:val="23"/>
         </w:rPr>
-        <w:t xml:space="preserve"> → </w:t>
+        <w:t xml:space="preserve">, chọn tiếp </w:t>
       </w:r>
       <w:r>
         <w:rPr>
@@ -3183,7 +3183,7 @@
           <w:sz w:val="23"/>
           <w:szCs w:val="23"/>
         </w:rPr>
-        <w:t xml:space="preserve"> → tắt mục </w:t>
+        <w:t xml:space="preserve">, sau đó tắt mục </w:t>
       </w:r>
       <w:r>
         <w:rPr>
@@ -3253,7 +3253,7 @@
           <w:sz w:val="23"/>
           <w:szCs w:val="23"/>
         </w:rPr>
-        <w:t xml:space="preserve"> → </w:t>
+        <w:t xml:space="preserve">, chọn </w:t>
       </w:r>
       <w:r>
         <w:rPr>
@@ -3273,7 +3273,7 @@
           <w:sz w:val="23"/>
           <w:szCs w:val="23"/>
         </w:rPr>
-        <w:t xml:space="preserve"> → chọn tắt lưu hoạt động nếu thầy cô không muốn lưu.</w:t>
+        <w:t xml:space="preserve">, sau đó chọn tắt lưu hoạt động nếu thầy cô không muốn lưu.</w:t>
       </w:r>
     </w:p>
     <w:p>

</xml_diff>